<commit_message>
added templates and renamed
</commit_message>
<xml_diff>
--- a/format/md-11/Inspection book.docx
+++ b/format/md-11/Inspection book.docx
@@ -1,6 +1,6 @@
 
 <file path=word/document.xml><?xml version="1.0" encoding="utf-8"?>
-<w:document xmlns:wpc="http://schemas.microsoft.com/office/word/2010/wordprocessingCanvas" xmlns:cx="http://schemas.microsoft.com/office/drawing/2014/chartex" xmlns:cx1="http://schemas.microsoft.com/office/drawing/2015/9/8/chartex" xmlns:cx2="http://schemas.microsoft.com/office/drawing/2015/10/21/chartex" xmlns:cx3="http://schemas.microsoft.com/office/drawing/2016/5/9/chartex" xmlns:cx4="http://schemas.microsoft.com/office/drawing/2016/5/10/chartex" xmlns:cx5="http://schemas.microsoft.com/office/drawing/2016/5/11/chartex" xmlns:cx6="http://schemas.microsoft.com/office/drawing/2016/5/12/chartex" xmlns:cx7="http://schemas.microsoft.com/office/drawing/2016/5/13/chartex" xmlns:cx8="http://schemas.microsoft.com/office/drawing/2016/5/14/chartex" xmlns:mc="http://schemas.openxmlformats.org/markup-compatibility/2006" xmlns:aink="http://schemas.microsoft.com/office/drawing/2016/ink" xmlns:am3d="http://schemas.microsoft.com/office/drawing/2017/model3d" xmlns:o="urn:schemas-microsoft-com:office:office" xmlns:r="http://schemas.openxmlformats.org/officeDocument/2006/relationships" xmlns:m="http://schemas.openxmlformats.org/officeDocument/2006/math" xmlns:v="urn:schemas-microsoft-com:vml" xmlns:wp14="http://schemas.microsoft.com/office/word/2010/wordprocessingDrawing" xmlns:wp="http://schemas.openxmlformats.org/drawingml/2006/wordprocessingDrawing" xmlns:w10="urn:schemas-microsoft-com:office:word" xmlns:w="http://schemas.openxmlformats.org/wordprocessingml/2006/main" xmlns:w14="http://schemas.microsoft.com/office/word/2010/wordml" xmlns:w15="http://schemas.microsoft.com/office/word/2012/wordml" xmlns:w16cex="http://schemas.microsoft.com/office/word/2018/wordml/cex" xmlns:w16cid="http://schemas.microsoft.com/office/word/2016/wordml/cid" xmlns:w16="http://schemas.microsoft.com/office/word/2018/wordml" xmlns:w16sdtdh="http://schemas.microsoft.com/office/word/2020/wordml/sdtdatahash" xmlns:w16se="http://schemas.microsoft.com/office/word/2015/wordml/symex" xmlns:wpg="http://schemas.microsoft.com/office/word/2010/wordprocessingGroup" xmlns:wpi="http://schemas.microsoft.com/office/word/2010/wordprocessingInk" xmlns:wne="http://schemas.microsoft.com/office/word/2006/wordml" xmlns:wps="http://schemas.microsoft.com/office/word/2010/wordprocessingShape" mc:Ignorable="w14 w15 w16se w16cid w16 w16cex w16sdtdh wp14">
+<w:document xmlns:wpc="http://schemas.microsoft.com/office/word/2010/wordprocessingCanvas" xmlns:cx="http://schemas.microsoft.com/office/drawing/2014/chartex" xmlns:cx1="http://schemas.microsoft.com/office/drawing/2015/9/8/chartex" xmlns:cx2="http://schemas.microsoft.com/office/drawing/2015/10/21/chartex" xmlns:cx3="http://schemas.microsoft.com/office/drawing/2016/5/9/chartex" xmlns:cx4="http://schemas.microsoft.com/office/drawing/2016/5/10/chartex" xmlns:cx5="http://schemas.microsoft.com/office/drawing/2016/5/11/chartex" xmlns:cx6="http://schemas.microsoft.com/office/drawing/2016/5/12/chartex" xmlns:cx7="http://schemas.microsoft.com/office/drawing/2016/5/13/chartex" xmlns:cx8="http://schemas.microsoft.com/office/drawing/2016/5/14/chartex" xmlns:mc="http://schemas.openxmlformats.org/markup-compatibility/2006" xmlns:aink="http://schemas.microsoft.com/office/drawing/2016/ink" xmlns:am3d="http://schemas.microsoft.com/office/drawing/2017/model3d" xmlns:o="urn:schemas-microsoft-com:office:office" xmlns:oel="http://schemas.microsoft.com/office/2019/extlst" xmlns:r="http://schemas.openxmlformats.org/officeDocument/2006/relationships" xmlns:m="http://schemas.openxmlformats.org/officeDocument/2006/math" xmlns:v="urn:schemas-microsoft-com:vml" xmlns:wp14="http://schemas.microsoft.com/office/word/2010/wordprocessingDrawing" xmlns:wp="http://schemas.openxmlformats.org/drawingml/2006/wordprocessingDrawing" xmlns:w10="urn:schemas-microsoft-com:office:word" xmlns:w="http://schemas.openxmlformats.org/wordprocessingml/2006/main" xmlns:w14="http://schemas.microsoft.com/office/word/2010/wordml" xmlns:w15="http://schemas.microsoft.com/office/word/2012/wordml" xmlns:w16cei="http://schemas.microsoft.com/office/word/2026/wordml/cei" xmlns:w16cex="http://schemas.microsoft.com/office/word/2018/wordml/cex" xmlns:w16cid="http://schemas.microsoft.com/office/word/2016/wordml/cid" xmlns:w16="http://schemas.microsoft.com/office/word/2018/wordml" xmlns:w16du="http://schemas.microsoft.com/office/word/2023/wordml/word16du" xmlns:w16sdtdh="http://schemas.microsoft.com/office/word/2020/wordml/sdtdatahash" xmlns:w16sdtfl="http://schemas.microsoft.com/office/word/2024/wordml/sdtformatlock" xmlns:w16se="http://schemas.microsoft.com/office/word/2015/wordml/symex" xmlns:wpg="http://schemas.microsoft.com/office/word/2010/wordprocessingGroup" xmlns:wpi="http://schemas.microsoft.com/office/word/2010/wordprocessingInk" xmlns:wne="http://schemas.microsoft.com/office/word/2006/wordml" xmlns:wps="http://schemas.microsoft.com/office/word/2010/wordprocessingShape" mc:Ignorable="w14 w15 w16se w16cid w16 w16cex w16sdtdh w16sdtfl w16du wp14">
   <w:body>
     <w:p>
       <w:pPr>
@@ -452,59 +452,11 @@
       <w:pPr>
         <w:spacing w:line="20" w:lineRule="exact"/>
       </w:pPr>
-      <w:r>
-        <w:rPr>
-          <w:noProof/>
-        </w:rPr>
-        <w:drawing>
-          <wp:anchor distT="0" distB="0" distL="0" distR="0" simplePos="0" relativeHeight="251649536" behindDoc="0" locked="0" layoutInCell="1" allowOverlap="1" wp14:anchorId="73C76C9E" wp14:editId="449ED8D1">
-            <wp:simplePos x="0" y="0"/>
-            <wp:positionH relativeFrom="page">
-              <wp:posOffset>612648</wp:posOffset>
-            </wp:positionH>
-            <wp:positionV relativeFrom="page">
-              <wp:posOffset>8769096</wp:posOffset>
-            </wp:positionV>
-            <wp:extent cx="6336792" cy="1442971"/>
-            <wp:effectExtent l="0" t="0" r="0" b="0"/>
-            <wp:wrapNone/>
-            <wp:docPr id="1" name="Picture 1"/>
-            <wp:cNvGraphicFramePr>
-              <a:graphicFrameLocks xmlns:a="http://schemas.openxmlformats.org/drawingml/2006/main" noChangeAspect="1"/>
-            </wp:cNvGraphicFramePr>
-            <a:graphic xmlns:a="http://schemas.openxmlformats.org/drawingml/2006/main">
-              <a:graphicData uri="http://schemas.openxmlformats.org/drawingml/2006/picture">
-                <pic:pic xmlns:pic="http://schemas.openxmlformats.org/drawingml/2006/picture">
-                  <pic:nvPicPr>
-                    <pic:cNvPr id="0" name="page1.png"/>
-                    <pic:cNvPicPr/>
-                  </pic:nvPicPr>
-                  <pic:blipFill>
-                    <a:blip r:embed="rId8"/>
-                    <a:stretch>
-                      <a:fillRect/>
-                    </a:stretch>
-                  </pic:blipFill>
-                  <pic:spPr>
-                    <a:xfrm>
-                      <a:off x="0" y="0"/>
-                      <a:ext cx="6336792" cy="1442971"/>
-                    </a:xfrm>
-                    <a:prstGeom prst="rect">
-                      <a:avLst/>
-                    </a:prstGeom>
-                  </pic:spPr>
-                </pic:pic>
-              </a:graphicData>
-            </a:graphic>
-          </wp:anchor>
-        </w:drawing>
-      </w:r>
     </w:p>
     <w:p>
       <w:pPr>
         <w:sectPr>
-          <w:headerReference w:type="default" r:id="rId9"/>
+          <w:headerReference w:type="default" r:id="rId8"/>
           <w:pgSz w:w="11909" w:h="16834"/>
           <w:pgMar w:top="2592" w:right="1066" w:bottom="3082" w:left="1670" w:header="1498" w:footer="720" w:gutter="0"/>
           <w:cols w:space="720"/>
@@ -1038,59 +990,11 @@
       <w:pPr>
         <w:spacing w:line="20" w:lineRule="exact"/>
       </w:pPr>
-      <w:r>
-        <w:rPr>
-          <w:noProof/>
-        </w:rPr>
-        <w:drawing>
-          <wp:anchor distT="0" distB="0" distL="0" distR="0" simplePos="0" relativeHeight="251650560" behindDoc="0" locked="0" layoutInCell="1" allowOverlap="1" wp14:anchorId="1CF0A7AA" wp14:editId="575CE126">
-            <wp:simplePos x="0" y="0"/>
-            <wp:positionH relativeFrom="page">
-              <wp:posOffset>612648</wp:posOffset>
-            </wp:positionH>
-            <wp:positionV relativeFrom="page">
-              <wp:posOffset>8769096</wp:posOffset>
-            </wp:positionV>
-            <wp:extent cx="6336792" cy="1442971"/>
-            <wp:effectExtent l="0" t="0" r="0" b="0"/>
-            <wp:wrapNone/>
-            <wp:docPr id="2" name="Picture 2"/>
-            <wp:cNvGraphicFramePr>
-              <a:graphicFrameLocks xmlns:a="http://schemas.openxmlformats.org/drawingml/2006/main" noChangeAspect="1"/>
-            </wp:cNvGraphicFramePr>
-            <a:graphic xmlns:a="http://schemas.openxmlformats.org/drawingml/2006/main">
-              <a:graphicData uri="http://schemas.openxmlformats.org/drawingml/2006/picture">
-                <pic:pic xmlns:pic="http://schemas.openxmlformats.org/drawingml/2006/picture">
-                  <pic:nvPicPr>
-                    <pic:cNvPr id="0" name="page2.png"/>
-                    <pic:cNvPicPr/>
-                  </pic:nvPicPr>
-                  <pic:blipFill>
-                    <a:blip r:embed="rId10"/>
-                    <a:stretch>
-                      <a:fillRect/>
-                    </a:stretch>
-                  </pic:blipFill>
-                  <pic:spPr>
-                    <a:xfrm>
-                      <a:off x="0" y="0"/>
-                      <a:ext cx="6336792" cy="1442971"/>
-                    </a:xfrm>
-                    <a:prstGeom prst="rect">
-                      <a:avLst/>
-                    </a:prstGeom>
-                  </pic:spPr>
-                </pic:pic>
-              </a:graphicData>
-            </a:graphic>
-          </wp:anchor>
-        </w:drawing>
-      </w:r>
     </w:p>
     <w:p>
       <w:pPr>
         <w:sectPr>
-          <w:footerReference w:type="default" r:id="rId11"/>
+          <w:footerReference w:type="default" r:id="rId9"/>
           <w:pgSz w:w="11909" w:h="16834"/>
           <w:pgMar w:top="2592" w:right="1066" w:bottom="3082" w:left="1670" w:header="1498" w:footer="720" w:gutter="0"/>
           <w:cols w:space="720"/>
@@ -1238,61 +1142,8 @@
     </w:p>
     <w:p>
       <w:pPr>
-        <w:spacing w:line="20" w:lineRule="exact"/>
-      </w:pPr>
-      <w:r>
-        <w:rPr>
-          <w:noProof/>
-        </w:rPr>
-        <w:drawing>
-          <wp:anchor distT="0" distB="0" distL="0" distR="0" simplePos="0" relativeHeight="251651584" behindDoc="0" locked="0" layoutInCell="1" allowOverlap="1" wp14:anchorId="21365815" wp14:editId="3CDDD8F9">
-            <wp:simplePos x="0" y="0"/>
-            <wp:positionH relativeFrom="page">
-              <wp:posOffset>612648</wp:posOffset>
-            </wp:positionH>
-            <wp:positionV relativeFrom="page">
-              <wp:posOffset>8769096</wp:posOffset>
-            </wp:positionV>
-            <wp:extent cx="6336792" cy="1442971"/>
-            <wp:effectExtent l="0" t="0" r="0" b="0"/>
-            <wp:wrapNone/>
-            <wp:docPr id="3" name="Picture 3"/>
-            <wp:cNvGraphicFramePr>
-              <a:graphicFrameLocks xmlns:a="http://schemas.openxmlformats.org/drawingml/2006/main" noChangeAspect="1"/>
-            </wp:cNvGraphicFramePr>
-            <a:graphic xmlns:a="http://schemas.openxmlformats.org/drawingml/2006/main">
-              <a:graphicData uri="http://schemas.openxmlformats.org/drawingml/2006/picture">
-                <pic:pic xmlns:pic="http://schemas.openxmlformats.org/drawingml/2006/picture">
-                  <pic:nvPicPr>
-                    <pic:cNvPr id="0" name="page3.png"/>
-                    <pic:cNvPicPr/>
-                  </pic:nvPicPr>
-                  <pic:blipFill>
-                    <a:blip r:embed="rId12"/>
-                    <a:stretch>
-                      <a:fillRect/>
-                    </a:stretch>
-                  </pic:blipFill>
-                  <pic:spPr>
-                    <a:xfrm>
-                      <a:off x="0" y="0"/>
-                      <a:ext cx="6336792" cy="1442971"/>
-                    </a:xfrm>
-                    <a:prstGeom prst="rect">
-                      <a:avLst/>
-                    </a:prstGeom>
-                  </pic:spPr>
-                </pic:pic>
-              </a:graphicData>
-            </a:graphic>
-          </wp:anchor>
-        </w:drawing>
-      </w:r>
-    </w:p>
-    <w:p>
-      <w:pPr>
         <w:sectPr>
-          <w:footerReference w:type="default" r:id="rId13"/>
+          <w:footerReference w:type="default" r:id="rId10"/>
           <w:pgSz w:w="11909" w:h="16834"/>
           <w:pgMar w:top="2592" w:right="1066" w:bottom="3082" w:left="1670" w:header="1498" w:footer="720" w:gutter="0"/>
           <w:cols w:space="720"/>
@@ -1924,61 +1775,8 @@
     </w:tbl>
     <w:p>
       <w:pPr>
-        <w:spacing w:line="20" w:lineRule="exact"/>
-      </w:pPr>
-      <w:r>
-        <w:rPr>
-          <w:noProof/>
-        </w:rPr>
-        <w:drawing>
-          <wp:anchor distT="0" distB="0" distL="0" distR="0" simplePos="0" relativeHeight="251652608" behindDoc="0" locked="0" layoutInCell="1" allowOverlap="1" wp14:anchorId="25D99CE7" wp14:editId="28651898">
-            <wp:simplePos x="0" y="0"/>
-            <wp:positionH relativeFrom="page">
-              <wp:posOffset>612648</wp:posOffset>
-            </wp:positionH>
-            <wp:positionV relativeFrom="page">
-              <wp:posOffset>8769096</wp:posOffset>
-            </wp:positionV>
-            <wp:extent cx="6336792" cy="1442971"/>
-            <wp:effectExtent l="0" t="0" r="0" b="0"/>
-            <wp:wrapNone/>
-            <wp:docPr id="4" name="Picture 4"/>
-            <wp:cNvGraphicFramePr>
-              <a:graphicFrameLocks xmlns:a="http://schemas.openxmlformats.org/drawingml/2006/main" noChangeAspect="1"/>
-            </wp:cNvGraphicFramePr>
-            <a:graphic xmlns:a="http://schemas.openxmlformats.org/drawingml/2006/main">
-              <a:graphicData uri="http://schemas.openxmlformats.org/drawingml/2006/picture">
-                <pic:pic xmlns:pic="http://schemas.openxmlformats.org/drawingml/2006/picture">
-                  <pic:nvPicPr>
-                    <pic:cNvPr id="0" name="page4.png"/>
-                    <pic:cNvPicPr/>
-                  </pic:nvPicPr>
-                  <pic:blipFill>
-                    <a:blip r:embed="rId14"/>
-                    <a:stretch>
-                      <a:fillRect/>
-                    </a:stretch>
-                  </pic:blipFill>
-                  <pic:spPr>
-                    <a:xfrm>
-                      <a:off x="0" y="0"/>
-                      <a:ext cx="6336792" cy="1442971"/>
-                    </a:xfrm>
-                    <a:prstGeom prst="rect">
-                      <a:avLst/>
-                    </a:prstGeom>
-                  </pic:spPr>
-                </pic:pic>
-              </a:graphicData>
-            </a:graphic>
-          </wp:anchor>
-        </w:drawing>
-      </w:r>
-    </w:p>
-    <w:p>
-      <w:pPr>
         <w:sectPr>
-          <w:footerReference w:type="default" r:id="rId15"/>
+          <w:footerReference w:type="default" r:id="rId11"/>
           <w:pgSz w:w="11909" w:h="16834"/>
           <w:pgMar w:top="2592" w:right="1066" w:bottom="3082" w:left="1670" w:header="1498" w:footer="720" w:gutter="0"/>
           <w:cols w:space="720"/>
@@ -2264,7 +2062,7 @@
     <w:p>
       <w:pPr>
         <w:sectPr>
-          <w:footerReference w:type="default" r:id="rId16"/>
+          <w:footerReference w:type="default" r:id="rId12"/>
           <w:pgSz w:w="11909" w:h="16834"/>
           <w:pgMar w:top="2592" w:right="1066" w:bottom="3082" w:left="1670" w:header="1498" w:footer="720" w:gutter="0"/>
           <w:cols w:space="720"/>
@@ -2412,7 +2210,7 @@
     <w:p>
       <w:pPr>
         <w:sectPr>
-          <w:footerReference w:type="default" r:id="rId17"/>
+          <w:footerReference w:type="default" r:id="rId13"/>
           <w:pgSz w:w="11909" w:h="16834"/>
           <w:pgMar w:top="2592" w:right="1066" w:bottom="3082" w:left="1670" w:header="1498" w:footer="720" w:gutter="0"/>
           <w:cols w:space="720"/>
@@ -3636,59 +3434,11 @@
       <w:pPr>
         <w:spacing w:line="20" w:lineRule="exact"/>
       </w:pPr>
-      <w:r>
-        <w:rPr>
-          <w:noProof/>
-        </w:rPr>
-        <w:drawing>
-          <wp:anchor distT="0" distB="0" distL="0" distR="0" simplePos="0" relativeHeight="251656704" behindDoc="0" locked="0" layoutInCell="1" allowOverlap="1" wp14:anchorId="0B405DDE" wp14:editId="3F5DD43B">
-            <wp:simplePos x="0" y="0"/>
-            <wp:positionH relativeFrom="page">
-              <wp:posOffset>612648</wp:posOffset>
-            </wp:positionH>
-            <wp:positionV relativeFrom="page">
-              <wp:posOffset>8769096</wp:posOffset>
-            </wp:positionV>
-            <wp:extent cx="6336792" cy="1442971"/>
-            <wp:effectExtent l="0" t="0" r="0" b="0"/>
-            <wp:wrapNone/>
-            <wp:docPr id="8" name="Picture 8"/>
-            <wp:cNvGraphicFramePr>
-              <a:graphicFrameLocks xmlns:a="http://schemas.openxmlformats.org/drawingml/2006/main" noChangeAspect="1"/>
-            </wp:cNvGraphicFramePr>
-            <a:graphic xmlns:a="http://schemas.openxmlformats.org/drawingml/2006/main">
-              <a:graphicData uri="http://schemas.openxmlformats.org/drawingml/2006/picture">
-                <pic:pic xmlns:pic="http://schemas.openxmlformats.org/drawingml/2006/picture">
-                  <pic:nvPicPr>
-                    <pic:cNvPr id="0" name="page8.png"/>
-                    <pic:cNvPicPr/>
-                  </pic:nvPicPr>
-                  <pic:blipFill>
-                    <a:blip r:embed="rId18"/>
-                    <a:stretch>
-                      <a:fillRect/>
-                    </a:stretch>
-                  </pic:blipFill>
-                  <pic:spPr>
-                    <a:xfrm>
-                      <a:off x="0" y="0"/>
-                      <a:ext cx="6336792" cy="1442971"/>
-                    </a:xfrm>
-                    <a:prstGeom prst="rect">
-                      <a:avLst/>
-                    </a:prstGeom>
-                  </pic:spPr>
-                </pic:pic>
-              </a:graphicData>
-            </a:graphic>
-          </wp:anchor>
-        </w:drawing>
-      </w:r>
     </w:p>
     <w:p>
       <w:pPr>
         <w:sectPr>
-          <w:footerReference w:type="default" r:id="rId19"/>
+          <w:footerReference w:type="default" r:id="rId14"/>
           <w:pgSz w:w="11909" w:h="16834"/>
           <w:pgMar w:top="2592" w:right="1066" w:bottom="3082" w:left="1670" w:header="1498" w:footer="720" w:gutter="0"/>
           <w:cols w:space="720"/>
@@ -3944,7 +3694,7 @@
     <w:p>
       <w:pPr>
         <w:sectPr>
-          <w:footerReference w:type="default" r:id="rId20"/>
+          <w:footerReference w:type="default" r:id="rId15"/>
           <w:pgSz w:w="11909" w:h="16834"/>
           <w:pgMar w:top="2592" w:right="1066" w:bottom="3082" w:left="1670" w:header="1498" w:footer="720" w:gutter="0"/>
           <w:cols w:space="720"/>
@@ -4149,59 +3899,11 @@
       <w:pPr>
         <w:spacing w:line="20" w:lineRule="exact"/>
       </w:pPr>
-      <w:r>
-        <w:rPr>
-          <w:noProof/>
-        </w:rPr>
-        <w:drawing>
-          <wp:anchor distT="0" distB="0" distL="0" distR="0" simplePos="0" relativeHeight="251658752" behindDoc="0" locked="0" layoutInCell="1" allowOverlap="1" wp14:anchorId="4846E4EE" wp14:editId="62C960EA">
-            <wp:simplePos x="0" y="0"/>
-            <wp:positionH relativeFrom="page">
-              <wp:posOffset>612648</wp:posOffset>
-            </wp:positionH>
-            <wp:positionV relativeFrom="page">
-              <wp:posOffset>8769096</wp:posOffset>
-            </wp:positionV>
-            <wp:extent cx="6336792" cy="1442971"/>
-            <wp:effectExtent l="0" t="0" r="0" b="0"/>
-            <wp:wrapNone/>
-            <wp:docPr id="10" name="Picture 10"/>
-            <wp:cNvGraphicFramePr>
-              <a:graphicFrameLocks xmlns:a="http://schemas.openxmlformats.org/drawingml/2006/main" noChangeAspect="1"/>
-            </wp:cNvGraphicFramePr>
-            <a:graphic xmlns:a="http://schemas.openxmlformats.org/drawingml/2006/main">
-              <a:graphicData uri="http://schemas.openxmlformats.org/drawingml/2006/picture">
-                <pic:pic xmlns:pic="http://schemas.openxmlformats.org/drawingml/2006/picture">
-                  <pic:nvPicPr>
-                    <pic:cNvPr id="0" name="page10.png"/>
-                    <pic:cNvPicPr/>
-                  </pic:nvPicPr>
-                  <pic:blipFill>
-                    <a:blip r:embed="rId21"/>
-                    <a:stretch>
-                      <a:fillRect/>
-                    </a:stretch>
-                  </pic:blipFill>
-                  <pic:spPr>
-                    <a:xfrm>
-                      <a:off x="0" y="0"/>
-                      <a:ext cx="6336792" cy="1442971"/>
-                    </a:xfrm>
-                    <a:prstGeom prst="rect">
-                      <a:avLst/>
-                    </a:prstGeom>
-                  </pic:spPr>
-                </pic:pic>
-              </a:graphicData>
-            </a:graphic>
-          </wp:anchor>
-        </w:drawing>
-      </w:r>
     </w:p>
     <w:p>
       <w:pPr>
         <w:sectPr>
-          <w:footerReference w:type="default" r:id="rId22"/>
+          <w:footerReference w:type="default" r:id="rId16"/>
           <w:pgSz w:w="11909" w:h="16834"/>
           <w:pgMar w:top="2592" w:right="1066" w:bottom="3082" w:left="1670" w:header="1498" w:footer="720" w:gutter="0"/>
           <w:cols w:space="720"/>
@@ -4462,59 +4164,11 @@
       <w:pPr>
         <w:spacing w:line="20" w:lineRule="exact"/>
       </w:pPr>
-      <w:r>
-        <w:rPr>
-          <w:noProof/>
-        </w:rPr>
-        <w:drawing>
-          <wp:anchor distT="0" distB="0" distL="0" distR="0" simplePos="0" relativeHeight="251659776" behindDoc="0" locked="0" layoutInCell="1" allowOverlap="1" wp14:anchorId="6297E4C5" wp14:editId="78304BC1">
-            <wp:simplePos x="0" y="0"/>
-            <wp:positionH relativeFrom="page">
-              <wp:posOffset>612648</wp:posOffset>
-            </wp:positionH>
-            <wp:positionV relativeFrom="page">
-              <wp:posOffset>8769096</wp:posOffset>
-            </wp:positionV>
-            <wp:extent cx="6336792" cy="1442971"/>
-            <wp:effectExtent l="0" t="0" r="0" b="0"/>
-            <wp:wrapNone/>
-            <wp:docPr id="11" name="Picture 11"/>
-            <wp:cNvGraphicFramePr>
-              <a:graphicFrameLocks xmlns:a="http://schemas.openxmlformats.org/drawingml/2006/main" noChangeAspect="1"/>
-            </wp:cNvGraphicFramePr>
-            <a:graphic xmlns:a="http://schemas.openxmlformats.org/drawingml/2006/main">
-              <a:graphicData uri="http://schemas.openxmlformats.org/drawingml/2006/picture">
-                <pic:pic xmlns:pic="http://schemas.openxmlformats.org/drawingml/2006/picture">
-                  <pic:nvPicPr>
-                    <pic:cNvPr id="0" name="page11.png"/>
-                    <pic:cNvPicPr/>
-                  </pic:nvPicPr>
-                  <pic:blipFill>
-                    <a:blip r:embed="rId23"/>
-                    <a:stretch>
-                      <a:fillRect/>
-                    </a:stretch>
-                  </pic:blipFill>
-                  <pic:spPr>
-                    <a:xfrm>
-                      <a:off x="0" y="0"/>
-                      <a:ext cx="6336792" cy="1442971"/>
-                    </a:xfrm>
-                    <a:prstGeom prst="rect">
-                      <a:avLst/>
-                    </a:prstGeom>
-                  </pic:spPr>
-                </pic:pic>
-              </a:graphicData>
-            </a:graphic>
-          </wp:anchor>
-        </w:drawing>
-      </w:r>
     </w:p>
     <w:p>
       <w:pPr>
         <w:sectPr>
-          <w:footerReference w:type="default" r:id="rId24"/>
+          <w:footerReference w:type="default" r:id="rId17"/>
           <w:pgSz w:w="11909" w:h="16834"/>
           <w:pgMar w:top="2592" w:right="1066" w:bottom="3082" w:left="1670" w:header="1498" w:footer="720" w:gutter="0"/>
           <w:cols w:space="720"/>
@@ -4851,59 +4505,11 @@
       <w:pPr>
         <w:spacing w:line="20" w:lineRule="exact"/>
       </w:pPr>
-      <w:r>
-        <w:rPr>
-          <w:noProof/>
-        </w:rPr>
-        <w:drawing>
-          <wp:anchor distT="0" distB="0" distL="0" distR="0" simplePos="0" relativeHeight="251660800" behindDoc="0" locked="0" layoutInCell="1" allowOverlap="1" wp14:anchorId="6FD7246B" wp14:editId="2B9D2012">
-            <wp:simplePos x="0" y="0"/>
-            <wp:positionH relativeFrom="page">
-              <wp:posOffset>612648</wp:posOffset>
-            </wp:positionH>
-            <wp:positionV relativeFrom="page">
-              <wp:posOffset>8769096</wp:posOffset>
-            </wp:positionV>
-            <wp:extent cx="6336792" cy="1442971"/>
-            <wp:effectExtent l="0" t="0" r="0" b="0"/>
-            <wp:wrapNone/>
-            <wp:docPr id="12" name="Picture 12"/>
-            <wp:cNvGraphicFramePr>
-              <a:graphicFrameLocks xmlns:a="http://schemas.openxmlformats.org/drawingml/2006/main" noChangeAspect="1"/>
-            </wp:cNvGraphicFramePr>
-            <a:graphic xmlns:a="http://schemas.openxmlformats.org/drawingml/2006/main">
-              <a:graphicData uri="http://schemas.openxmlformats.org/drawingml/2006/picture">
-                <pic:pic xmlns:pic="http://schemas.openxmlformats.org/drawingml/2006/picture">
-                  <pic:nvPicPr>
-                    <pic:cNvPr id="0" name="page12.png"/>
-                    <pic:cNvPicPr/>
-                  </pic:nvPicPr>
-                  <pic:blipFill>
-                    <a:blip r:embed="rId25"/>
-                    <a:stretch>
-                      <a:fillRect/>
-                    </a:stretch>
-                  </pic:blipFill>
-                  <pic:spPr>
-                    <a:xfrm>
-                      <a:off x="0" y="0"/>
-                      <a:ext cx="6336792" cy="1442971"/>
-                    </a:xfrm>
-                    <a:prstGeom prst="rect">
-                      <a:avLst/>
-                    </a:prstGeom>
-                  </pic:spPr>
-                </pic:pic>
-              </a:graphicData>
-            </a:graphic>
-          </wp:anchor>
-        </w:drawing>
-      </w:r>
     </w:p>
     <w:p>
       <w:pPr>
         <w:sectPr>
-          <w:footerReference w:type="default" r:id="rId26"/>
+          <w:footerReference w:type="default" r:id="rId18"/>
           <w:pgSz w:w="11909" w:h="16834"/>
           <w:pgMar w:top="2592" w:right="1066" w:bottom="3082" w:left="1670" w:header="1498" w:footer="720" w:gutter="0"/>
           <w:cols w:space="720"/>
@@ -4981,107 +4587,11 @@
       <w:pPr>
         <w:spacing w:line="20" w:lineRule="exact"/>
       </w:pPr>
-      <w:r>
-        <w:rPr>
-          <w:noProof/>
-        </w:rPr>
-        <w:drawing>
-          <wp:anchor distT="0" distB="0" distL="0" distR="0" simplePos="0" relativeHeight="251661824" behindDoc="0" locked="0" layoutInCell="1" allowOverlap="1" wp14:anchorId="45E42E7A" wp14:editId="5DD7D34A">
-            <wp:simplePos x="0" y="0"/>
-            <wp:positionH relativeFrom="page">
-              <wp:posOffset>612648</wp:posOffset>
-            </wp:positionH>
-            <wp:positionV relativeFrom="page">
-              <wp:posOffset>8769096</wp:posOffset>
-            </wp:positionV>
-            <wp:extent cx="6336792" cy="1442971"/>
-            <wp:effectExtent l="0" t="0" r="0" b="0"/>
-            <wp:wrapNone/>
-            <wp:docPr id="13" name="Picture 13"/>
-            <wp:cNvGraphicFramePr>
-              <a:graphicFrameLocks xmlns:a="http://schemas.openxmlformats.org/drawingml/2006/main" noChangeAspect="1"/>
-            </wp:cNvGraphicFramePr>
-            <a:graphic xmlns:a="http://schemas.openxmlformats.org/drawingml/2006/main">
-              <a:graphicData uri="http://schemas.openxmlformats.org/drawingml/2006/picture">
-                <pic:pic xmlns:pic="http://schemas.openxmlformats.org/drawingml/2006/picture">
-                  <pic:nvPicPr>
-                    <pic:cNvPr id="0" name="page13.png"/>
-                    <pic:cNvPicPr/>
-                  </pic:nvPicPr>
-                  <pic:blipFill>
-                    <a:blip r:embed="rId27"/>
-                    <a:stretch>
-                      <a:fillRect/>
-                    </a:stretch>
-                  </pic:blipFill>
-                  <pic:spPr>
-                    <a:xfrm>
-                      <a:off x="0" y="0"/>
-                      <a:ext cx="6336792" cy="1442971"/>
-                    </a:xfrm>
-                    <a:prstGeom prst="rect">
-                      <a:avLst/>
-                    </a:prstGeom>
-                  </pic:spPr>
-                </pic:pic>
-              </a:graphicData>
-            </a:graphic>
-          </wp:anchor>
-        </w:drawing>
-      </w:r>
     </w:p>
     <w:p>
       <w:pPr>
         <w:spacing w:line="20" w:lineRule="exact"/>
       </w:pPr>
-      <w:r>
-        <w:rPr>
-          <w:noProof/>
-        </w:rPr>
-        <w:drawing>
-          <wp:anchor distT="0" distB="0" distL="0" distR="0" simplePos="0" relativeHeight="251662848" behindDoc="0" locked="0" layoutInCell="1" allowOverlap="1" wp14:anchorId="3BD196F9" wp14:editId="7299A72B">
-            <wp:simplePos x="0" y="0"/>
-            <wp:positionH relativeFrom="page">
-              <wp:posOffset>612648</wp:posOffset>
-            </wp:positionH>
-            <wp:positionV relativeFrom="page">
-              <wp:posOffset>8769096</wp:posOffset>
-            </wp:positionV>
-            <wp:extent cx="6336792" cy="1442971"/>
-            <wp:effectExtent l="0" t="0" r="0" b="0"/>
-            <wp:wrapNone/>
-            <wp:docPr id="14" name="Picture 14"/>
-            <wp:cNvGraphicFramePr>
-              <a:graphicFrameLocks xmlns:a="http://schemas.openxmlformats.org/drawingml/2006/main" noChangeAspect="1"/>
-            </wp:cNvGraphicFramePr>
-            <a:graphic xmlns:a="http://schemas.openxmlformats.org/drawingml/2006/main">
-              <a:graphicData uri="http://schemas.openxmlformats.org/drawingml/2006/picture">
-                <pic:pic xmlns:pic="http://schemas.openxmlformats.org/drawingml/2006/picture">
-                  <pic:nvPicPr>
-                    <pic:cNvPr id="0" name="page14.png"/>
-                    <pic:cNvPicPr/>
-                  </pic:nvPicPr>
-                  <pic:blipFill>
-                    <a:blip r:embed="rId28"/>
-                    <a:stretch>
-                      <a:fillRect/>
-                    </a:stretch>
-                  </pic:blipFill>
-                  <pic:spPr>
-                    <a:xfrm>
-                      <a:off x="0" y="0"/>
-                      <a:ext cx="6336792" cy="1442971"/>
-                    </a:xfrm>
-                    <a:prstGeom prst="rect">
-                      <a:avLst/>
-                    </a:prstGeom>
-                  </pic:spPr>
-                </pic:pic>
-              </a:graphicData>
-            </a:graphic>
-          </wp:anchor>
-        </w:drawing>
-      </w:r>
     </w:p>
     <w:p/>
     <w:p/>
@@ -5159,59 +4669,11 @@
       <w:pPr>
         <w:spacing w:line="20" w:lineRule="exact"/>
       </w:pPr>
-      <w:r>
-        <w:rPr>
-          <w:noProof/>
-        </w:rPr>
-        <w:drawing>
-          <wp:anchor distT="0" distB="0" distL="0" distR="0" simplePos="0" relativeHeight="251663872" behindDoc="0" locked="0" layoutInCell="1" allowOverlap="1" wp14:anchorId="0BAF1F3A" wp14:editId="584D9842">
-            <wp:simplePos x="0" y="0"/>
-            <wp:positionH relativeFrom="page">
-              <wp:posOffset>612648</wp:posOffset>
-            </wp:positionH>
-            <wp:positionV relativeFrom="page">
-              <wp:posOffset>8769096</wp:posOffset>
-            </wp:positionV>
-            <wp:extent cx="6336792" cy="1442971"/>
-            <wp:effectExtent l="0" t="0" r="0" b="0"/>
-            <wp:wrapNone/>
-            <wp:docPr id="15" name="Picture 15"/>
-            <wp:cNvGraphicFramePr>
-              <a:graphicFrameLocks xmlns:a="http://schemas.openxmlformats.org/drawingml/2006/main" noChangeAspect="1"/>
-            </wp:cNvGraphicFramePr>
-            <a:graphic xmlns:a="http://schemas.openxmlformats.org/drawingml/2006/main">
-              <a:graphicData uri="http://schemas.openxmlformats.org/drawingml/2006/picture">
-                <pic:pic xmlns:pic="http://schemas.openxmlformats.org/drawingml/2006/picture">
-                  <pic:nvPicPr>
-                    <pic:cNvPr id="0" name="page15.png"/>
-                    <pic:cNvPicPr/>
-                  </pic:nvPicPr>
-                  <pic:blipFill>
-                    <a:blip r:embed="rId29"/>
-                    <a:stretch>
-                      <a:fillRect/>
-                    </a:stretch>
-                  </pic:blipFill>
-                  <pic:spPr>
-                    <a:xfrm>
-                      <a:off x="0" y="0"/>
-                      <a:ext cx="6336792" cy="1442971"/>
-                    </a:xfrm>
-                    <a:prstGeom prst="rect">
-                      <a:avLst/>
-                    </a:prstGeom>
-                  </pic:spPr>
-                </pic:pic>
-              </a:graphicData>
-            </a:graphic>
-          </wp:anchor>
-        </w:drawing>
-      </w:r>
     </w:p>
     <w:p>
       <w:pPr>
         <w:sectPr>
-          <w:footerReference w:type="default" r:id="rId30"/>
+          <w:footerReference w:type="default" r:id="rId19"/>
           <w:pgSz w:w="11909" w:h="16834"/>
           <w:pgMar w:top="2592" w:right="1066" w:bottom="3082" w:left="1670" w:header="1498" w:footer="720" w:gutter="0"/>
           <w:cols w:space="720"/>
@@ -5564,78 +5026,9 @@
           </w:tcPr>
           <w:p>
             <w:pPr>
-              <w:spacing w:line="240" w:lineRule="auto"/>
-              <w:jc w:val="center"/>
-            </w:pPr>
-            <w:r>
-              <w:rPr>
-                <w:noProof/>
-              </w:rPr>
-              <w:drawing>
-                <wp:inline distT="0" distB="0" distL="0" distR="0" wp14:anchorId="33D711EA" wp14:editId="5CD71419">
-                  <wp:extent cx="1261872" cy="454861"/>
-                  <wp:effectExtent l="0" t="0" r="0" b="0"/>
-                  <wp:docPr id="16" name="Picture 16"/>
-                  <wp:cNvGraphicFramePr>
-                    <a:graphicFrameLocks xmlns:a="http://schemas.openxmlformats.org/drawingml/2006/main" noChangeAspect="1"/>
-                  </wp:cNvGraphicFramePr>
-                  <a:graphic xmlns:a="http://schemas.openxmlformats.org/drawingml/2006/main">
-                    <a:graphicData uri="http://schemas.openxmlformats.org/drawingml/2006/picture">
-                      <pic:pic xmlns:pic="http://schemas.openxmlformats.org/drawingml/2006/picture">
-                        <pic:nvPicPr>
-                          <pic:cNvPr id="0" name="signature1.png"/>
-                          <pic:cNvPicPr/>
-                        </pic:nvPicPr>
-                        <pic:blipFill>
-                          <a:blip r:embed="rId31"/>
-                          <a:stretch>
-                            <a:fillRect/>
-                          </a:stretch>
-                        </pic:blipFill>
-                        <pic:spPr>
-                          <a:xfrm>
-                            <a:off x="0" y="0"/>
-                            <a:ext cx="1261872" cy="454861"/>
-                          </a:xfrm>
-                          <a:prstGeom prst="rect">
-                            <a:avLst/>
-                          </a:prstGeom>
-                        </pic:spPr>
-                      </pic:pic>
-                    </a:graphicData>
-                  </a:graphic>
-                </wp:inline>
-              </w:drawing>
-            </w:r>
-          </w:p>
-          <w:p>
-            <w:pPr>
               <w:spacing w:line="190" w:lineRule="exact"/>
               <w:jc w:val="center"/>
             </w:pPr>
-            <w:r>
-              <w:rPr>
-                <w:rFonts w:eastAsia="Arial"/>
-                <w:sz w:val="16"/>
-              </w:rPr>
-              <w:t>(Pramod Kumar)</w:t>
-            </w:r>
-            <w:r>
-              <w:rPr>
-                <w:rFonts w:eastAsia="Arial"/>
-                <w:sz w:val="16"/>
-              </w:rPr>
-              <w:br/>
-              <w:t>Medical Device Officer,</w:t>
-            </w:r>
-            <w:r>
-              <w:rPr>
-                <w:rFonts w:eastAsia="Arial"/>
-                <w:sz w:val="16"/>
-              </w:rPr>
-              <w:br/>
-              <w:t>CDSCO, NZ, Ghaziabad</w:t>
-            </w:r>
           </w:p>
         </w:tc>
         <w:tc>
@@ -5651,78 +5044,9 @@
           </w:tcPr>
           <w:p>
             <w:pPr>
-              <w:spacing w:line="240" w:lineRule="auto"/>
-              <w:jc w:val="center"/>
-            </w:pPr>
-            <w:r>
-              <w:rPr>
-                <w:noProof/>
-              </w:rPr>
-              <w:drawing>
-                <wp:inline distT="0" distB="0" distL="0" distR="0" wp14:anchorId="422AF7F8" wp14:editId="0577CCB9">
-                  <wp:extent cx="1554480" cy="508739"/>
-                  <wp:effectExtent l="0" t="0" r="0" b="0"/>
-                  <wp:docPr id="17" name="Picture 17"/>
-                  <wp:cNvGraphicFramePr>
-                    <a:graphicFrameLocks xmlns:a="http://schemas.openxmlformats.org/drawingml/2006/main" noChangeAspect="1"/>
-                  </wp:cNvGraphicFramePr>
-                  <a:graphic xmlns:a="http://schemas.openxmlformats.org/drawingml/2006/main">
-                    <a:graphicData uri="http://schemas.openxmlformats.org/drawingml/2006/picture">
-                      <pic:pic xmlns:pic="http://schemas.openxmlformats.org/drawingml/2006/picture">
-                        <pic:nvPicPr>
-                          <pic:cNvPr id="0" name="signature2.png"/>
-                          <pic:cNvPicPr/>
-                        </pic:nvPicPr>
-                        <pic:blipFill>
-                          <a:blip r:embed="rId32"/>
-                          <a:stretch>
-                            <a:fillRect/>
-                          </a:stretch>
-                        </pic:blipFill>
-                        <pic:spPr>
-                          <a:xfrm>
-                            <a:off x="0" y="0"/>
-                            <a:ext cx="1554480" cy="508739"/>
-                          </a:xfrm>
-                          <a:prstGeom prst="rect">
-                            <a:avLst/>
-                          </a:prstGeom>
-                        </pic:spPr>
-                      </pic:pic>
-                    </a:graphicData>
-                  </a:graphic>
-                </wp:inline>
-              </w:drawing>
-            </w:r>
-          </w:p>
-          <w:p>
-            <w:pPr>
               <w:spacing w:line="190" w:lineRule="exact"/>
               <w:jc w:val="center"/>
             </w:pPr>
-            <w:r>
-              <w:rPr>
-                <w:rFonts w:eastAsia="Arial"/>
-                <w:sz w:val="16"/>
-              </w:rPr>
-              <w:t>(Devendra Pratap Singh)</w:t>
-            </w:r>
-            <w:r>
-              <w:rPr>
-                <w:rFonts w:eastAsia="Arial"/>
-                <w:sz w:val="16"/>
-              </w:rPr>
-              <w:br/>
-              <w:t>Medical Device Officer,</w:t>
-            </w:r>
-            <w:r>
-              <w:rPr>
-                <w:rFonts w:eastAsia="Arial"/>
-                <w:sz w:val="16"/>
-              </w:rPr>
-              <w:br/>
-              <w:t>CDSCO, NZ, Ghaziabad</w:t>
-            </w:r>
           </w:p>
         </w:tc>
         <w:tc>
@@ -5738,78 +5062,9 @@
           </w:tcPr>
           <w:p>
             <w:pPr>
-              <w:spacing w:line="240" w:lineRule="auto"/>
-              <w:jc w:val="center"/>
-            </w:pPr>
-            <w:r>
-              <w:rPr>
-                <w:noProof/>
-              </w:rPr>
-              <w:drawing>
-                <wp:inline distT="0" distB="0" distL="0" distR="0" wp14:anchorId="5FF590B3" wp14:editId="6ABD0568">
-                  <wp:extent cx="1554480" cy="508739"/>
-                  <wp:effectExtent l="0" t="0" r="0" b="0"/>
-                  <wp:docPr id="18" name="Picture 18"/>
-                  <wp:cNvGraphicFramePr>
-                    <a:graphicFrameLocks xmlns:a="http://schemas.openxmlformats.org/drawingml/2006/main" noChangeAspect="1"/>
-                  </wp:cNvGraphicFramePr>
-                  <a:graphic xmlns:a="http://schemas.openxmlformats.org/drawingml/2006/main">
-                    <a:graphicData uri="http://schemas.openxmlformats.org/drawingml/2006/picture">
-                      <pic:pic xmlns:pic="http://schemas.openxmlformats.org/drawingml/2006/picture">
-                        <pic:nvPicPr>
-                          <pic:cNvPr id="0" name="signature3.png"/>
-                          <pic:cNvPicPr/>
-                        </pic:nvPicPr>
-                        <pic:blipFill>
-                          <a:blip r:embed="rId33"/>
-                          <a:stretch>
-                            <a:fillRect/>
-                          </a:stretch>
-                        </pic:blipFill>
-                        <pic:spPr>
-                          <a:xfrm>
-                            <a:off x="0" y="0"/>
-                            <a:ext cx="1554480" cy="508739"/>
-                          </a:xfrm>
-                          <a:prstGeom prst="rect">
-                            <a:avLst/>
-                          </a:prstGeom>
-                        </pic:spPr>
-                      </pic:pic>
-                    </a:graphicData>
-                  </a:graphic>
-                </wp:inline>
-              </w:drawing>
-            </w:r>
-          </w:p>
-          <w:p>
-            <w:pPr>
               <w:spacing w:line="190" w:lineRule="exact"/>
               <w:jc w:val="center"/>
             </w:pPr>
-            <w:r>
-              <w:rPr>
-                <w:rFonts w:eastAsia="Arial"/>
-                <w:sz w:val="16"/>
-              </w:rPr>
-              <w:t>(Jal Singh)</w:t>
-            </w:r>
-            <w:r>
-              <w:rPr>
-                <w:rFonts w:eastAsia="Arial"/>
-                <w:sz w:val="16"/>
-              </w:rPr>
-              <w:br/>
-              <w:t>Drugs Inspector (Medical</w:t>
-            </w:r>
-            <w:r>
-              <w:rPr>
-                <w:rFonts w:eastAsia="Arial"/>
-                <w:sz w:val="16"/>
-              </w:rPr>
-              <w:br/>
-              <w:t>Device), CDSCO, HQ, Delhi.</w:t>
-            </w:r>
           </w:p>
         </w:tc>
       </w:tr>
@@ -5818,110 +5073,14 @@
       <w:pPr>
         <w:spacing w:line="20" w:lineRule="exact"/>
       </w:pPr>
-      <w:r>
-        <w:rPr>
-          <w:noProof/>
-        </w:rPr>
-        <w:drawing>
-          <wp:anchor distT="0" distB="0" distL="0" distR="0" simplePos="0" relativeHeight="251664896" behindDoc="0" locked="0" layoutInCell="1" allowOverlap="1" wp14:anchorId="70855393" wp14:editId="45E424B7">
-            <wp:simplePos x="0" y="0"/>
-            <wp:positionH relativeFrom="page">
-              <wp:posOffset>758952</wp:posOffset>
-            </wp:positionH>
-            <wp:positionV relativeFrom="page">
-              <wp:posOffset>8796528</wp:posOffset>
-            </wp:positionV>
-            <wp:extent cx="4754880" cy="1349772"/>
-            <wp:effectExtent l="0" t="0" r="0" b="0"/>
-            <wp:wrapNone/>
-            <wp:docPr id="19" name="Picture 19"/>
-            <wp:cNvGraphicFramePr>
-              <a:graphicFrameLocks xmlns:a="http://schemas.openxmlformats.org/drawingml/2006/main" noChangeAspect="1"/>
-            </wp:cNvGraphicFramePr>
-            <a:graphic xmlns:a="http://schemas.openxmlformats.org/drawingml/2006/main">
-              <a:graphicData uri="http://schemas.openxmlformats.org/drawingml/2006/picture">
-                <pic:pic xmlns:pic="http://schemas.openxmlformats.org/drawingml/2006/picture">
-                  <pic:nvPicPr>
-                    <pic:cNvPr id="0" name="received_stamp.png"/>
-                    <pic:cNvPicPr/>
-                  </pic:nvPicPr>
-                  <pic:blipFill>
-                    <a:blip r:embed="rId34"/>
-                    <a:stretch>
-                      <a:fillRect/>
-                    </a:stretch>
-                  </pic:blipFill>
-                  <pic:spPr>
-                    <a:xfrm>
-                      <a:off x="0" y="0"/>
-                      <a:ext cx="4754880" cy="1349772"/>
-                    </a:xfrm>
-                    <a:prstGeom prst="rect">
-                      <a:avLst/>
-                    </a:prstGeom>
-                  </pic:spPr>
-                </pic:pic>
-              </a:graphicData>
-            </a:graphic>
-          </wp:anchor>
-        </w:drawing>
-      </w:r>
     </w:p>
     <w:p>
       <w:pPr>
         <w:spacing w:line="20" w:lineRule="exact"/>
       </w:pPr>
-      <w:r>
-        <w:rPr>
-          <w:noProof/>
-        </w:rPr>
-        <w:drawing>
-          <wp:anchor distT="0" distB="0" distL="0" distR="0" simplePos="0" relativeHeight="251665920" behindDoc="0" locked="0" layoutInCell="1" allowOverlap="1" wp14:anchorId="5C615320" wp14:editId="1CBED9E1">
-            <wp:simplePos x="0" y="0"/>
-            <wp:positionH relativeFrom="page">
-              <wp:posOffset>6519672</wp:posOffset>
-            </wp:positionH>
-            <wp:positionV relativeFrom="page">
-              <wp:posOffset>8842248</wp:posOffset>
-            </wp:positionV>
-            <wp:extent cx="365760" cy="731520"/>
-            <wp:effectExtent l="0" t="0" r="0" b="0"/>
-            <wp:wrapNone/>
-            <wp:docPr id="20" name="Picture 20"/>
-            <wp:cNvGraphicFramePr>
-              <a:graphicFrameLocks xmlns:a="http://schemas.openxmlformats.org/drawingml/2006/main" noChangeAspect="1"/>
-            </wp:cNvGraphicFramePr>
-            <a:graphic xmlns:a="http://schemas.openxmlformats.org/drawingml/2006/main">
-              <a:graphicData uri="http://schemas.openxmlformats.org/drawingml/2006/picture">
-                <pic:pic xmlns:pic="http://schemas.openxmlformats.org/drawingml/2006/picture">
-                  <pic:nvPicPr>
-                    <pic:cNvPr id="0" name="page16_number.png"/>
-                    <pic:cNvPicPr/>
-                  </pic:nvPicPr>
-                  <pic:blipFill>
-                    <a:blip r:embed="rId35"/>
-                    <a:stretch>
-                      <a:fillRect/>
-                    </a:stretch>
-                  </pic:blipFill>
-                  <pic:spPr>
-                    <a:xfrm>
-                      <a:off x="0" y="0"/>
-                      <a:ext cx="365760" cy="731520"/>
-                    </a:xfrm>
-                    <a:prstGeom prst="rect">
-                      <a:avLst/>
-                    </a:prstGeom>
-                  </pic:spPr>
-                </pic:pic>
-              </a:graphicData>
-            </a:graphic>
-          </wp:anchor>
-        </w:drawing>
-      </w:r>
     </w:p>
     <w:sectPr>
-      <w:footerReference w:type="default" r:id="rId36"/>
+      <w:footerReference w:type="default" r:id="rId20"/>
       <w:pgSz w:w="11909" w:h="16834"/>
       <w:pgMar w:top="2592" w:right="1066" w:bottom="3082" w:left="1670" w:header="1498" w:footer="720" w:gutter="0"/>
       <w:cols w:space="720"/>
@@ -5932,7 +5091,7 @@
 </file>
 
 <file path=word/endnotes.xml><?xml version="1.0" encoding="utf-8"?>
-<w:endnotes xmlns:wpc="http://schemas.microsoft.com/office/word/2010/wordprocessingCanvas" xmlns:cx="http://schemas.microsoft.com/office/drawing/2014/chartex" xmlns:cx1="http://schemas.microsoft.com/office/drawing/2015/9/8/chartex" xmlns:cx2="http://schemas.microsoft.com/office/drawing/2015/10/21/chartex" xmlns:cx3="http://schemas.microsoft.com/office/drawing/2016/5/9/chartex" xmlns:cx4="http://schemas.microsoft.com/office/drawing/2016/5/10/chartex" xmlns:cx5="http://schemas.microsoft.com/office/drawing/2016/5/11/chartex" xmlns:cx6="http://schemas.microsoft.com/office/drawing/2016/5/12/chartex" xmlns:cx7="http://schemas.microsoft.com/office/drawing/2016/5/13/chartex" xmlns:cx8="http://schemas.microsoft.com/office/drawing/2016/5/14/chartex" xmlns:mc="http://schemas.openxmlformats.org/markup-compatibility/2006" xmlns:aink="http://schemas.microsoft.com/office/drawing/2016/ink" xmlns:am3d="http://schemas.microsoft.com/office/drawing/2017/model3d" xmlns:o="urn:schemas-microsoft-com:office:office" xmlns:r="http://schemas.openxmlformats.org/officeDocument/2006/relationships" xmlns:m="http://schemas.openxmlformats.org/officeDocument/2006/math" xmlns:v="urn:schemas-microsoft-com:vml" xmlns:wp14="http://schemas.microsoft.com/office/word/2010/wordprocessingDrawing" xmlns:wp="http://schemas.openxmlformats.org/drawingml/2006/wordprocessingDrawing" xmlns:w10="urn:schemas-microsoft-com:office:word" xmlns:w="http://schemas.openxmlformats.org/wordprocessingml/2006/main" xmlns:w14="http://schemas.microsoft.com/office/word/2010/wordml" xmlns:w15="http://schemas.microsoft.com/office/word/2012/wordml" xmlns:w16cex="http://schemas.microsoft.com/office/word/2018/wordml/cex" xmlns:w16cid="http://schemas.microsoft.com/office/word/2016/wordml/cid" xmlns:w16="http://schemas.microsoft.com/office/word/2018/wordml" xmlns:w16sdtdh="http://schemas.microsoft.com/office/word/2020/wordml/sdtdatahash" xmlns:w16se="http://schemas.microsoft.com/office/word/2015/wordml/symex" xmlns:wpg="http://schemas.microsoft.com/office/word/2010/wordprocessingGroup" xmlns:wpi="http://schemas.microsoft.com/office/word/2010/wordprocessingInk" xmlns:wne="http://schemas.microsoft.com/office/word/2006/wordml" xmlns:wps="http://schemas.microsoft.com/office/word/2010/wordprocessingShape" mc:Ignorable="w14 w15 w16se w16cid w16 w16cex w16sdtdh wp14">
+<w:endnotes xmlns:wpc="http://schemas.microsoft.com/office/word/2010/wordprocessingCanvas" xmlns:cx="http://schemas.microsoft.com/office/drawing/2014/chartex" xmlns:cx1="http://schemas.microsoft.com/office/drawing/2015/9/8/chartex" xmlns:cx2="http://schemas.microsoft.com/office/drawing/2015/10/21/chartex" xmlns:cx3="http://schemas.microsoft.com/office/drawing/2016/5/9/chartex" xmlns:cx4="http://schemas.microsoft.com/office/drawing/2016/5/10/chartex" xmlns:cx5="http://schemas.microsoft.com/office/drawing/2016/5/11/chartex" xmlns:cx6="http://schemas.microsoft.com/office/drawing/2016/5/12/chartex" xmlns:cx7="http://schemas.microsoft.com/office/drawing/2016/5/13/chartex" xmlns:cx8="http://schemas.microsoft.com/office/drawing/2016/5/14/chartex" xmlns:mc="http://schemas.openxmlformats.org/markup-compatibility/2006" xmlns:aink="http://schemas.microsoft.com/office/drawing/2016/ink" xmlns:am3d="http://schemas.microsoft.com/office/drawing/2017/model3d" xmlns:o="urn:schemas-microsoft-com:office:office" xmlns:oel="http://schemas.microsoft.com/office/2019/extlst" xmlns:r="http://schemas.openxmlformats.org/officeDocument/2006/relationships" xmlns:m="http://schemas.openxmlformats.org/officeDocument/2006/math" xmlns:v="urn:schemas-microsoft-com:vml" xmlns:wp14="http://schemas.microsoft.com/office/word/2010/wordprocessingDrawing" xmlns:wp="http://schemas.openxmlformats.org/drawingml/2006/wordprocessingDrawing" xmlns:w10="urn:schemas-microsoft-com:office:word" xmlns:w="http://schemas.openxmlformats.org/wordprocessingml/2006/main" xmlns:w14="http://schemas.microsoft.com/office/word/2010/wordml" xmlns:w15="http://schemas.microsoft.com/office/word/2012/wordml" xmlns:w16cei="http://schemas.microsoft.com/office/word/2026/wordml/cei" xmlns:w16cex="http://schemas.microsoft.com/office/word/2018/wordml/cex" xmlns:w16cid="http://schemas.microsoft.com/office/word/2016/wordml/cid" xmlns:w16="http://schemas.microsoft.com/office/word/2018/wordml" xmlns:w16du="http://schemas.microsoft.com/office/word/2023/wordml/word16du" xmlns:w16sdtdh="http://schemas.microsoft.com/office/word/2020/wordml/sdtdatahash" xmlns:w16sdtfl="http://schemas.microsoft.com/office/word/2024/wordml/sdtformatlock" xmlns:w16se="http://schemas.microsoft.com/office/word/2015/wordml/symex" xmlns:wpg="http://schemas.microsoft.com/office/word/2010/wordprocessingGroup" xmlns:wpi="http://schemas.microsoft.com/office/word/2010/wordprocessingInk" xmlns:wne="http://schemas.microsoft.com/office/word/2006/wordml" xmlns:wps="http://schemas.microsoft.com/office/word/2010/wordprocessingShape" mc:Ignorable="w14 w15 w16se w16cid w16 w16cex w16sdtdh w16sdtfl w16du wp14">
   <w:endnote w:type="separator" w:id="-1">
     <w:p>
       <w:pPr>
@@ -5957,7 +5116,7 @@
 </file>
 
 <file path=word/footer1.xml><?xml version="1.0" encoding="utf-8"?>
-<w:ftr xmlns:wpc="http://schemas.microsoft.com/office/word/2010/wordprocessingCanvas" xmlns:cx="http://schemas.microsoft.com/office/drawing/2014/chartex" xmlns:cx1="http://schemas.microsoft.com/office/drawing/2015/9/8/chartex" xmlns:cx2="http://schemas.microsoft.com/office/drawing/2015/10/21/chartex" xmlns:cx3="http://schemas.microsoft.com/office/drawing/2016/5/9/chartex" xmlns:cx4="http://schemas.microsoft.com/office/drawing/2016/5/10/chartex" xmlns:cx5="http://schemas.microsoft.com/office/drawing/2016/5/11/chartex" xmlns:cx6="http://schemas.microsoft.com/office/drawing/2016/5/12/chartex" xmlns:cx7="http://schemas.microsoft.com/office/drawing/2016/5/13/chartex" xmlns:cx8="http://schemas.microsoft.com/office/drawing/2016/5/14/chartex" xmlns:mc="http://schemas.openxmlformats.org/markup-compatibility/2006" xmlns:aink="http://schemas.microsoft.com/office/drawing/2016/ink" xmlns:am3d="http://schemas.microsoft.com/office/drawing/2017/model3d" xmlns:o="urn:schemas-microsoft-com:office:office" xmlns:r="http://schemas.openxmlformats.org/officeDocument/2006/relationships" xmlns:m="http://schemas.openxmlformats.org/officeDocument/2006/math" xmlns:v="urn:schemas-microsoft-com:vml" xmlns:wp14="http://schemas.microsoft.com/office/word/2010/wordprocessingDrawing" xmlns:wp="http://schemas.openxmlformats.org/drawingml/2006/wordprocessingDrawing" xmlns:w10="urn:schemas-microsoft-com:office:word" xmlns:w="http://schemas.openxmlformats.org/wordprocessingml/2006/main" xmlns:w14="http://schemas.microsoft.com/office/word/2010/wordml" xmlns:w15="http://schemas.microsoft.com/office/word/2012/wordml" xmlns:w16cex="http://schemas.microsoft.com/office/word/2018/wordml/cex" xmlns:w16cid="http://schemas.microsoft.com/office/word/2016/wordml/cid" xmlns:w16="http://schemas.microsoft.com/office/word/2018/wordml" xmlns:w16sdtdh="http://schemas.microsoft.com/office/word/2020/wordml/sdtdatahash" xmlns:w16se="http://schemas.microsoft.com/office/word/2015/wordml/symex" xmlns:wpg="http://schemas.microsoft.com/office/word/2010/wordprocessingGroup" xmlns:wpi="http://schemas.microsoft.com/office/word/2010/wordprocessingInk" xmlns:wne="http://schemas.microsoft.com/office/word/2006/wordml" xmlns:wps="http://schemas.microsoft.com/office/word/2010/wordprocessingShape" mc:Ignorable="w14 w15 w16se w16cid w16 w16cex w16sdtdh wp14">
+<w:ftr xmlns:wpc="http://schemas.microsoft.com/office/word/2010/wordprocessingCanvas" xmlns:cx="http://schemas.microsoft.com/office/drawing/2014/chartex" xmlns:cx1="http://schemas.microsoft.com/office/drawing/2015/9/8/chartex" xmlns:cx2="http://schemas.microsoft.com/office/drawing/2015/10/21/chartex" xmlns:cx3="http://schemas.microsoft.com/office/drawing/2016/5/9/chartex" xmlns:cx4="http://schemas.microsoft.com/office/drawing/2016/5/10/chartex" xmlns:cx5="http://schemas.microsoft.com/office/drawing/2016/5/11/chartex" xmlns:cx6="http://schemas.microsoft.com/office/drawing/2016/5/12/chartex" xmlns:cx7="http://schemas.microsoft.com/office/drawing/2016/5/13/chartex" xmlns:cx8="http://schemas.microsoft.com/office/drawing/2016/5/14/chartex" xmlns:mc="http://schemas.openxmlformats.org/markup-compatibility/2006" xmlns:aink="http://schemas.microsoft.com/office/drawing/2016/ink" xmlns:am3d="http://schemas.microsoft.com/office/drawing/2017/model3d" xmlns:o="urn:schemas-microsoft-com:office:office" xmlns:oel="http://schemas.microsoft.com/office/2019/extlst" xmlns:r="http://schemas.openxmlformats.org/officeDocument/2006/relationships" xmlns:m="http://schemas.openxmlformats.org/officeDocument/2006/math" xmlns:v="urn:schemas-microsoft-com:vml" xmlns:wp14="http://schemas.microsoft.com/office/word/2010/wordprocessingDrawing" xmlns:wp="http://schemas.openxmlformats.org/drawingml/2006/wordprocessingDrawing" xmlns:w10="urn:schemas-microsoft-com:office:word" xmlns:w="http://schemas.openxmlformats.org/wordprocessingml/2006/main" xmlns:w14="http://schemas.microsoft.com/office/word/2010/wordml" xmlns:w15="http://schemas.microsoft.com/office/word/2012/wordml" xmlns:w16cei="http://schemas.microsoft.com/office/word/2026/wordml/cei" xmlns:w16cex="http://schemas.microsoft.com/office/word/2018/wordml/cex" xmlns:w16cid="http://schemas.microsoft.com/office/word/2016/wordml/cid" xmlns:w16="http://schemas.microsoft.com/office/word/2018/wordml" xmlns:w16du="http://schemas.microsoft.com/office/word/2023/wordml/word16du" xmlns:w16sdtdh="http://schemas.microsoft.com/office/word/2020/wordml/sdtdatahash" xmlns:w16sdtfl="http://schemas.microsoft.com/office/word/2024/wordml/sdtformatlock" xmlns:w16se="http://schemas.microsoft.com/office/word/2015/wordml/symex" xmlns:wpg="http://schemas.microsoft.com/office/word/2010/wordprocessingGroup" xmlns:wpi="http://schemas.microsoft.com/office/word/2010/wordprocessingInk" xmlns:wne="http://schemas.microsoft.com/office/word/2006/wordml" xmlns:wps="http://schemas.microsoft.com/office/word/2010/wordprocessingShape" mc:Ignorable="w14 w15 w16se w16cid w16 w16cex w16sdtdh w16sdtfl w16du wp14">
   <w:p>
     <w:pPr>
       <w:pStyle w:val="Footer"/>
@@ -5967,7 +5126,7 @@
 </file>
 
 <file path=word/footer10.xml><?xml version="1.0" encoding="utf-8"?>
-<w:ftr xmlns:wpc="http://schemas.microsoft.com/office/word/2010/wordprocessingCanvas" xmlns:cx="http://schemas.microsoft.com/office/drawing/2014/chartex" xmlns:cx1="http://schemas.microsoft.com/office/drawing/2015/9/8/chartex" xmlns:cx2="http://schemas.microsoft.com/office/drawing/2015/10/21/chartex" xmlns:cx3="http://schemas.microsoft.com/office/drawing/2016/5/9/chartex" xmlns:cx4="http://schemas.microsoft.com/office/drawing/2016/5/10/chartex" xmlns:cx5="http://schemas.microsoft.com/office/drawing/2016/5/11/chartex" xmlns:cx6="http://schemas.microsoft.com/office/drawing/2016/5/12/chartex" xmlns:cx7="http://schemas.microsoft.com/office/drawing/2016/5/13/chartex" xmlns:cx8="http://schemas.microsoft.com/office/drawing/2016/5/14/chartex" xmlns:mc="http://schemas.openxmlformats.org/markup-compatibility/2006" xmlns:aink="http://schemas.microsoft.com/office/drawing/2016/ink" xmlns:am3d="http://schemas.microsoft.com/office/drawing/2017/model3d" xmlns:o="urn:schemas-microsoft-com:office:office" xmlns:r="http://schemas.openxmlformats.org/officeDocument/2006/relationships" xmlns:m="http://schemas.openxmlformats.org/officeDocument/2006/math" xmlns:v="urn:schemas-microsoft-com:vml" xmlns:wp14="http://schemas.microsoft.com/office/word/2010/wordprocessingDrawing" xmlns:wp="http://schemas.openxmlformats.org/drawingml/2006/wordprocessingDrawing" xmlns:w10="urn:schemas-microsoft-com:office:word" xmlns:w="http://schemas.openxmlformats.org/wordprocessingml/2006/main" xmlns:w14="http://schemas.microsoft.com/office/word/2010/wordml" xmlns:w15="http://schemas.microsoft.com/office/word/2012/wordml" xmlns:w16cex="http://schemas.microsoft.com/office/word/2018/wordml/cex" xmlns:w16cid="http://schemas.microsoft.com/office/word/2016/wordml/cid" xmlns:w16="http://schemas.microsoft.com/office/word/2018/wordml" xmlns:w16sdtdh="http://schemas.microsoft.com/office/word/2020/wordml/sdtdatahash" xmlns:w16se="http://schemas.microsoft.com/office/word/2015/wordml/symex" xmlns:wpg="http://schemas.microsoft.com/office/word/2010/wordprocessingGroup" xmlns:wpi="http://schemas.microsoft.com/office/word/2010/wordprocessingInk" xmlns:wne="http://schemas.microsoft.com/office/word/2006/wordml" xmlns:wps="http://schemas.microsoft.com/office/word/2010/wordprocessingShape" mc:Ignorable="w14 w15 w16se w16cid w16 w16cex w16sdtdh wp14">
+<w:ftr xmlns:wpc="http://schemas.microsoft.com/office/word/2010/wordprocessingCanvas" xmlns:cx="http://schemas.microsoft.com/office/drawing/2014/chartex" xmlns:cx1="http://schemas.microsoft.com/office/drawing/2015/9/8/chartex" xmlns:cx2="http://schemas.microsoft.com/office/drawing/2015/10/21/chartex" xmlns:cx3="http://schemas.microsoft.com/office/drawing/2016/5/9/chartex" xmlns:cx4="http://schemas.microsoft.com/office/drawing/2016/5/10/chartex" xmlns:cx5="http://schemas.microsoft.com/office/drawing/2016/5/11/chartex" xmlns:cx6="http://schemas.microsoft.com/office/drawing/2016/5/12/chartex" xmlns:cx7="http://schemas.microsoft.com/office/drawing/2016/5/13/chartex" xmlns:cx8="http://schemas.microsoft.com/office/drawing/2016/5/14/chartex" xmlns:mc="http://schemas.openxmlformats.org/markup-compatibility/2006" xmlns:aink="http://schemas.microsoft.com/office/drawing/2016/ink" xmlns:am3d="http://schemas.microsoft.com/office/drawing/2017/model3d" xmlns:o="urn:schemas-microsoft-com:office:office" xmlns:oel="http://schemas.microsoft.com/office/2019/extlst" xmlns:r="http://schemas.openxmlformats.org/officeDocument/2006/relationships" xmlns:m="http://schemas.openxmlformats.org/officeDocument/2006/math" xmlns:v="urn:schemas-microsoft-com:vml" xmlns:wp14="http://schemas.microsoft.com/office/word/2010/wordprocessingDrawing" xmlns:wp="http://schemas.openxmlformats.org/drawingml/2006/wordprocessingDrawing" xmlns:w10="urn:schemas-microsoft-com:office:word" xmlns:w="http://schemas.openxmlformats.org/wordprocessingml/2006/main" xmlns:w14="http://schemas.microsoft.com/office/word/2010/wordml" xmlns:w15="http://schemas.microsoft.com/office/word/2012/wordml" xmlns:w16cei="http://schemas.microsoft.com/office/word/2026/wordml/cei" xmlns:w16cex="http://schemas.microsoft.com/office/word/2018/wordml/cex" xmlns:w16cid="http://schemas.microsoft.com/office/word/2016/wordml/cid" xmlns:w16="http://schemas.microsoft.com/office/word/2018/wordml" xmlns:w16du="http://schemas.microsoft.com/office/word/2023/wordml/word16du" xmlns:w16sdtdh="http://schemas.microsoft.com/office/word/2020/wordml/sdtdatahash" xmlns:w16sdtfl="http://schemas.microsoft.com/office/word/2024/wordml/sdtformatlock" xmlns:w16se="http://schemas.microsoft.com/office/word/2015/wordml/symex" xmlns:wpg="http://schemas.microsoft.com/office/word/2010/wordprocessingGroup" xmlns:wpi="http://schemas.microsoft.com/office/word/2010/wordprocessingInk" xmlns:wne="http://schemas.microsoft.com/office/word/2006/wordml" xmlns:wps="http://schemas.microsoft.com/office/word/2010/wordprocessingShape" mc:Ignorable="w14 w15 w16se w16cid w16 w16cex w16sdtdh w16sdtfl w16du wp14">
   <w:p>
     <w:pPr>
       <w:pStyle w:val="Footer"/>
@@ -5977,7 +5136,7 @@
 </file>
 
 <file path=word/footer11.xml><?xml version="1.0" encoding="utf-8"?>
-<w:ftr xmlns:wpc="http://schemas.microsoft.com/office/word/2010/wordprocessingCanvas" xmlns:cx="http://schemas.microsoft.com/office/drawing/2014/chartex" xmlns:cx1="http://schemas.microsoft.com/office/drawing/2015/9/8/chartex" xmlns:cx2="http://schemas.microsoft.com/office/drawing/2015/10/21/chartex" xmlns:cx3="http://schemas.microsoft.com/office/drawing/2016/5/9/chartex" xmlns:cx4="http://schemas.microsoft.com/office/drawing/2016/5/10/chartex" xmlns:cx5="http://schemas.microsoft.com/office/drawing/2016/5/11/chartex" xmlns:cx6="http://schemas.microsoft.com/office/drawing/2016/5/12/chartex" xmlns:cx7="http://schemas.microsoft.com/office/drawing/2016/5/13/chartex" xmlns:cx8="http://schemas.microsoft.com/office/drawing/2016/5/14/chartex" xmlns:mc="http://schemas.openxmlformats.org/markup-compatibility/2006" xmlns:aink="http://schemas.microsoft.com/office/drawing/2016/ink" xmlns:am3d="http://schemas.microsoft.com/office/drawing/2017/model3d" xmlns:o="urn:schemas-microsoft-com:office:office" xmlns:r="http://schemas.openxmlformats.org/officeDocument/2006/relationships" xmlns:m="http://schemas.openxmlformats.org/officeDocument/2006/math" xmlns:v="urn:schemas-microsoft-com:vml" xmlns:wp14="http://schemas.microsoft.com/office/word/2010/wordprocessingDrawing" xmlns:wp="http://schemas.openxmlformats.org/drawingml/2006/wordprocessingDrawing" xmlns:w10="urn:schemas-microsoft-com:office:word" xmlns:w="http://schemas.openxmlformats.org/wordprocessingml/2006/main" xmlns:w14="http://schemas.microsoft.com/office/word/2010/wordml" xmlns:w15="http://schemas.microsoft.com/office/word/2012/wordml" xmlns:w16cex="http://schemas.microsoft.com/office/word/2018/wordml/cex" xmlns:w16cid="http://schemas.microsoft.com/office/word/2016/wordml/cid" xmlns:w16="http://schemas.microsoft.com/office/word/2018/wordml" xmlns:w16sdtdh="http://schemas.microsoft.com/office/word/2020/wordml/sdtdatahash" xmlns:w16se="http://schemas.microsoft.com/office/word/2015/wordml/symex" xmlns:wpg="http://schemas.microsoft.com/office/word/2010/wordprocessingGroup" xmlns:wpi="http://schemas.microsoft.com/office/word/2010/wordprocessingInk" xmlns:wne="http://schemas.microsoft.com/office/word/2006/wordml" xmlns:wps="http://schemas.microsoft.com/office/word/2010/wordprocessingShape" mc:Ignorable="w14 w15 w16se w16cid w16 w16cex w16sdtdh wp14">
+<w:ftr xmlns:wpc="http://schemas.microsoft.com/office/word/2010/wordprocessingCanvas" xmlns:cx="http://schemas.microsoft.com/office/drawing/2014/chartex" xmlns:cx1="http://schemas.microsoft.com/office/drawing/2015/9/8/chartex" xmlns:cx2="http://schemas.microsoft.com/office/drawing/2015/10/21/chartex" xmlns:cx3="http://schemas.microsoft.com/office/drawing/2016/5/9/chartex" xmlns:cx4="http://schemas.microsoft.com/office/drawing/2016/5/10/chartex" xmlns:cx5="http://schemas.microsoft.com/office/drawing/2016/5/11/chartex" xmlns:cx6="http://schemas.microsoft.com/office/drawing/2016/5/12/chartex" xmlns:cx7="http://schemas.microsoft.com/office/drawing/2016/5/13/chartex" xmlns:cx8="http://schemas.microsoft.com/office/drawing/2016/5/14/chartex" xmlns:mc="http://schemas.openxmlformats.org/markup-compatibility/2006" xmlns:aink="http://schemas.microsoft.com/office/drawing/2016/ink" xmlns:am3d="http://schemas.microsoft.com/office/drawing/2017/model3d" xmlns:o="urn:schemas-microsoft-com:office:office" xmlns:oel="http://schemas.microsoft.com/office/2019/extlst" xmlns:r="http://schemas.openxmlformats.org/officeDocument/2006/relationships" xmlns:m="http://schemas.openxmlformats.org/officeDocument/2006/math" xmlns:v="urn:schemas-microsoft-com:vml" xmlns:wp14="http://schemas.microsoft.com/office/word/2010/wordprocessingDrawing" xmlns:wp="http://schemas.openxmlformats.org/drawingml/2006/wordprocessingDrawing" xmlns:w10="urn:schemas-microsoft-com:office:word" xmlns:w="http://schemas.openxmlformats.org/wordprocessingml/2006/main" xmlns:w14="http://schemas.microsoft.com/office/word/2010/wordml" xmlns:w15="http://schemas.microsoft.com/office/word/2012/wordml" xmlns:w16cei="http://schemas.microsoft.com/office/word/2026/wordml/cei" xmlns:w16cex="http://schemas.microsoft.com/office/word/2018/wordml/cex" xmlns:w16cid="http://schemas.microsoft.com/office/word/2016/wordml/cid" xmlns:w16="http://schemas.microsoft.com/office/word/2018/wordml" xmlns:w16du="http://schemas.microsoft.com/office/word/2023/wordml/word16du" xmlns:w16sdtdh="http://schemas.microsoft.com/office/word/2020/wordml/sdtdatahash" xmlns:w16sdtfl="http://schemas.microsoft.com/office/word/2024/wordml/sdtformatlock" xmlns:w16se="http://schemas.microsoft.com/office/word/2015/wordml/symex" xmlns:wpg="http://schemas.microsoft.com/office/word/2010/wordprocessingGroup" xmlns:wpi="http://schemas.microsoft.com/office/word/2010/wordprocessingInk" xmlns:wne="http://schemas.microsoft.com/office/word/2006/wordml" xmlns:wps="http://schemas.microsoft.com/office/word/2010/wordprocessingShape" mc:Ignorable="w14 w15 w16se w16cid w16 w16cex w16sdtdh w16sdtfl w16du wp14">
   <w:p>
     <w:pPr>
       <w:pStyle w:val="Footer"/>
@@ -5987,7 +5146,7 @@
 </file>
 
 <file path=word/footer12.xml><?xml version="1.0" encoding="utf-8"?>
-<w:ftr xmlns:wpc="http://schemas.microsoft.com/office/word/2010/wordprocessingCanvas" xmlns:cx="http://schemas.microsoft.com/office/drawing/2014/chartex" xmlns:cx1="http://schemas.microsoft.com/office/drawing/2015/9/8/chartex" xmlns:cx2="http://schemas.microsoft.com/office/drawing/2015/10/21/chartex" xmlns:cx3="http://schemas.microsoft.com/office/drawing/2016/5/9/chartex" xmlns:cx4="http://schemas.microsoft.com/office/drawing/2016/5/10/chartex" xmlns:cx5="http://schemas.microsoft.com/office/drawing/2016/5/11/chartex" xmlns:cx6="http://schemas.microsoft.com/office/drawing/2016/5/12/chartex" xmlns:cx7="http://schemas.microsoft.com/office/drawing/2016/5/13/chartex" xmlns:cx8="http://schemas.microsoft.com/office/drawing/2016/5/14/chartex" xmlns:mc="http://schemas.openxmlformats.org/markup-compatibility/2006" xmlns:aink="http://schemas.microsoft.com/office/drawing/2016/ink" xmlns:am3d="http://schemas.microsoft.com/office/drawing/2017/model3d" xmlns:o="urn:schemas-microsoft-com:office:office" xmlns:r="http://schemas.openxmlformats.org/officeDocument/2006/relationships" xmlns:m="http://schemas.openxmlformats.org/officeDocument/2006/math" xmlns:v="urn:schemas-microsoft-com:vml" xmlns:wp14="http://schemas.microsoft.com/office/word/2010/wordprocessingDrawing" xmlns:wp="http://schemas.openxmlformats.org/drawingml/2006/wordprocessingDrawing" xmlns:w10="urn:schemas-microsoft-com:office:word" xmlns:w="http://schemas.openxmlformats.org/wordprocessingml/2006/main" xmlns:w14="http://schemas.microsoft.com/office/word/2010/wordml" xmlns:w15="http://schemas.microsoft.com/office/word/2012/wordml" xmlns:w16cex="http://schemas.microsoft.com/office/word/2018/wordml/cex" xmlns:w16cid="http://schemas.microsoft.com/office/word/2016/wordml/cid" xmlns:w16="http://schemas.microsoft.com/office/word/2018/wordml" xmlns:w16sdtdh="http://schemas.microsoft.com/office/word/2020/wordml/sdtdatahash" xmlns:w16se="http://schemas.microsoft.com/office/word/2015/wordml/symex" xmlns:wpg="http://schemas.microsoft.com/office/word/2010/wordprocessingGroup" xmlns:wpi="http://schemas.microsoft.com/office/word/2010/wordprocessingInk" xmlns:wne="http://schemas.microsoft.com/office/word/2006/wordml" xmlns:wps="http://schemas.microsoft.com/office/word/2010/wordprocessingShape" mc:Ignorable="w14 w15 w16se w16cid w16 w16cex w16sdtdh wp14">
+<w:ftr xmlns:wpc="http://schemas.microsoft.com/office/word/2010/wordprocessingCanvas" xmlns:cx="http://schemas.microsoft.com/office/drawing/2014/chartex" xmlns:cx1="http://schemas.microsoft.com/office/drawing/2015/9/8/chartex" xmlns:cx2="http://schemas.microsoft.com/office/drawing/2015/10/21/chartex" xmlns:cx3="http://schemas.microsoft.com/office/drawing/2016/5/9/chartex" xmlns:cx4="http://schemas.microsoft.com/office/drawing/2016/5/10/chartex" xmlns:cx5="http://schemas.microsoft.com/office/drawing/2016/5/11/chartex" xmlns:cx6="http://schemas.microsoft.com/office/drawing/2016/5/12/chartex" xmlns:cx7="http://schemas.microsoft.com/office/drawing/2016/5/13/chartex" xmlns:cx8="http://schemas.microsoft.com/office/drawing/2016/5/14/chartex" xmlns:mc="http://schemas.openxmlformats.org/markup-compatibility/2006" xmlns:aink="http://schemas.microsoft.com/office/drawing/2016/ink" xmlns:am3d="http://schemas.microsoft.com/office/drawing/2017/model3d" xmlns:o="urn:schemas-microsoft-com:office:office" xmlns:oel="http://schemas.microsoft.com/office/2019/extlst" xmlns:r="http://schemas.openxmlformats.org/officeDocument/2006/relationships" xmlns:m="http://schemas.openxmlformats.org/officeDocument/2006/math" xmlns:v="urn:schemas-microsoft-com:vml" xmlns:wp14="http://schemas.microsoft.com/office/word/2010/wordprocessingDrawing" xmlns:wp="http://schemas.openxmlformats.org/drawingml/2006/wordprocessingDrawing" xmlns:w10="urn:schemas-microsoft-com:office:word" xmlns:w="http://schemas.openxmlformats.org/wordprocessingml/2006/main" xmlns:w14="http://schemas.microsoft.com/office/word/2010/wordml" xmlns:w15="http://schemas.microsoft.com/office/word/2012/wordml" xmlns:w16cei="http://schemas.microsoft.com/office/word/2026/wordml/cei" xmlns:w16cex="http://schemas.microsoft.com/office/word/2018/wordml/cex" xmlns:w16cid="http://schemas.microsoft.com/office/word/2016/wordml/cid" xmlns:w16="http://schemas.microsoft.com/office/word/2018/wordml" xmlns:w16du="http://schemas.microsoft.com/office/word/2023/wordml/word16du" xmlns:w16sdtdh="http://schemas.microsoft.com/office/word/2020/wordml/sdtdatahash" xmlns:w16sdtfl="http://schemas.microsoft.com/office/word/2024/wordml/sdtformatlock" xmlns:w16se="http://schemas.microsoft.com/office/word/2015/wordml/symex" xmlns:wpg="http://schemas.microsoft.com/office/word/2010/wordprocessingGroup" xmlns:wpi="http://schemas.microsoft.com/office/word/2010/wordprocessingInk" xmlns:wne="http://schemas.microsoft.com/office/word/2006/wordml" xmlns:wps="http://schemas.microsoft.com/office/word/2010/wordprocessingShape" mc:Ignorable="w14 w15 w16se w16cid w16 w16cex w16sdtdh w16sdtfl w16du wp14">
   <w:p>
     <w:pPr>
       <w:pStyle w:val="Footer"/>
@@ -5997,7 +5156,7 @@
 </file>
 
 <file path=word/footer2.xml><?xml version="1.0" encoding="utf-8"?>
-<w:ftr xmlns:wpc="http://schemas.microsoft.com/office/word/2010/wordprocessingCanvas" xmlns:cx="http://schemas.microsoft.com/office/drawing/2014/chartex" xmlns:cx1="http://schemas.microsoft.com/office/drawing/2015/9/8/chartex" xmlns:cx2="http://schemas.microsoft.com/office/drawing/2015/10/21/chartex" xmlns:cx3="http://schemas.microsoft.com/office/drawing/2016/5/9/chartex" xmlns:cx4="http://schemas.microsoft.com/office/drawing/2016/5/10/chartex" xmlns:cx5="http://schemas.microsoft.com/office/drawing/2016/5/11/chartex" xmlns:cx6="http://schemas.microsoft.com/office/drawing/2016/5/12/chartex" xmlns:cx7="http://schemas.microsoft.com/office/drawing/2016/5/13/chartex" xmlns:cx8="http://schemas.microsoft.com/office/drawing/2016/5/14/chartex" xmlns:mc="http://schemas.openxmlformats.org/markup-compatibility/2006" xmlns:aink="http://schemas.microsoft.com/office/drawing/2016/ink" xmlns:am3d="http://schemas.microsoft.com/office/drawing/2017/model3d" xmlns:o="urn:schemas-microsoft-com:office:office" xmlns:r="http://schemas.openxmlformats.org/officeDocument/2006/relationships" xmlns:m="http://schemas.openxmlformats.org/officeDocument/2006/math" xmlns:v="urn:schemas-microsoft-com:vml" xmlns:wp14="http://schemas.microsoft.com/office/word/2010/wordprocessingDrawing" xmlns:wp="http://schemas.openxmlformats.org/drawingml/2006/wordprocessingDrawing" xmlns:w10="urn:schemas-microsoft-com:office:word" xmlns:w="http://schemas.openxmlformats.org/wordprocessingml/2006/main" xmlns:w14="http://schemas.microsoft.com/office/word/2010/wordml" xmlns:w15="http://schemas.microsoft.com/office/word/2012/wordml" xmlns:w16cex="http://schemas.microsoft.com/office/word/2018/wordml/cex" xmlns:w16cid="http://schemas.microsoft.com/office/word/2016/wordml/cid" xmlns:w16="http://schemas.microsoft.com/office/word/2018/wordml" xmlns:w16sdtdh="http://schemas.microsoft.com/office/word/2020/wordml/sdtdatahash" xmlns:w16se="http://schemas.microsoft.com/office/word/2015/wordml/symex" xmlns:wpg="http://schemas.microsoft.com/office/word/2010/wordprocessingGroup" xmlns:wpi="http://schemas.microsoft.com/office/word/2010/wordprocessingInk" xmlns:wne="http://schemas.microsoft.com/office/word/2006/wordml" xmlns:wps="http://schemas.microsoft.com/office/word/2010/wordprocessingShape" mc:Ignorable="w14 w15 w16se w16cid w16 w16cex w16sdtdh wp14">
+<w:ftr xmlns:wpc="http://schemas.microsoft.com/office/word/2010/wordprocessingCanvas" xmlns:cx="http://schemas.microsoft.com/office/drawing/2014/chartex" xmlns:cx1="http://schemas.microsoft.com/office/drawing/2015/9/8/chartex" xmlns:cx2="http://schemas.microsoft.com/office/drawing/2015/10/21/chartex" xmlns:cx3="http://schemas.microsoft.com/office/drawing/2016/5/9/chartex" xmlns:cx4="http://schemas.microsoft.com/office/drawing/2016/5/10/chartex" xmlns:cx5="http://schemas.microsoft.com/office/drawing/2016/5/11/chartex" xmlns:cx6="http://schemas.microsoft.com/office/drawing/2016/5/12/chartex" xmlns:cx7="http://schemas.microsoft.com/office/drawing/2016/5/13/chartex" xmlns:cx8="http://schemas.microsoft.com/office/drawing/2016/5/14/chartex" xmlns:mc="http://schemas.openxmlformats.org/markup-compatibility/2006" xmlns:aink="http://schemas.microsoft.com/office/drawing/2016/ink" xmlns:am3d="http://schemas.microsoft.com/office/drawing/2017/model3d" xmlns:o="urn:schemas-microsoft-com:office:office" xmlns:oel="http://schemas.microsoft.com/office/2019/extlst" xmlns:r="http://schemas.openxmlformats.org/officeDocument/2006/relationships" xmlns:m="http://schemas.openxmlformats.org/officeDocument/2006/math" xmlns:v="urn:schemas-microsoft-com:vml" xmlns:wp14="http://schemas.microsoft.com/office/word/2010/wordprocessingDrawing" xmlns:wp="http://schemas.openxmlformats.org/drawingml/2006/wordprocessingDrawing" xmlns:w10="urn:schemas-microsoft-com:office:word" xmlns:w="http://schemas.openxmlformats.org/wordprocessingml/2006/main" xmlns:w14="http://schemas.microsoft.com/office/word/2010/wordml" xmlns:w15="http://schemas.microsoft.com/office/word/2012/wordml" xmlns:w16cei="http://schemas.microsoft.com/office/word/2026/wordml/cei" xmlns:w16cex="http://schemas.microsoft.com/office/word/2018/wordml/cex" xmlns:w16cid="http://schemas.microsoft.com/office/word/2016/wordml/cid" xmlns:w16="http://schemas.microsoft.com/office/word/2018/wordml" xmlns:w16du="http://schemas.microsoft.com/office/word/2023/wordml/word16du" xmlns:w16sdtdh="http://schemas.microsoft.com/office/word/2020/wordml/sdtdatahash" xmlns:w16sdtfl="http://schemas.microsoft.com/office/word/2024/wordml/sdtformatlock" xmlns:w16se="http://schemas.microsoft.com/office/word/2015/wordml/symex" xmlns:wpg="http://schemas.microsoft.com/office/word/2010/wordprocessingGroup" xmlns:wpi="http://schemas.microsoft.com/office/word/2010/wordprocessingInk" xmlns:wne="http://schemas.microsoft.com/office/word/2006/wordml" xmlns:wps="http://schemas.microsoft.com/office/word/2010/wordprocessingShape" mc:Ignorable="w14 w15 w16se w16cid w16 w16cex w16sdtdh w16sdtfl w16du wp14">
   <w:p>
     <w:pPr>
       <w:pStyle w:val="Footer"/>
@@ -6007,7 +5166,7 @@
 </file>
 
 <file path=word/footer3.xml><?xml version="1.0" encoding="utf-8"?>
-<w:ftr xmlns:wpc="http://schemas.microsoft.com/office/word/2010/wordprocessingCanvas" xmlns:cx="http://schemas.microsoft.com/office/drawing/2014/chartex" xmlns:cx1="http://schemas.microsoft.com/office/drawing/2015/9/8/chartex" xmlns:cx2="http://schemas.microsoft.com/office/drawing/2015/10/21/chartex" xmlns:cx3="http://schemas.microsoft.com/office/drawing/2016/5/9/chartex" xmlns:cx4="http://schemas.microsoft.com/office/drawing/2016/5/10/chartex" xmlns:cx5="http://schemas.microsoft.com/office/drawing/2016/5/11/chartex" xmlns:cx6="http://schemas.microsoft.com/office/drawing/2016/5/12/chartex" xmlns:cx7="http://schemas.microsoft.com/office/drawing/2016/5/13/chartex" xmlns:cx8="http://schemas.microsoft.com/office/drawing/2016/5/14/chartex" xmlns:mc="http://schemas.openxmlformats.org/markup-compatibility/2006" xmlns:aink="http://schemas.microsoft.com/office/drawing/2016/ink" xmlns:am3d="http://schemas.microsoft.com/office/drawing/2017/model3d" xmlns:o="urn:schemas-microsoft-com:office:office" xmlns:r="http://schemas.openxmlformats.org/officeDocument/2006/relationships" xmlns:m="http://schemas.openxmlformats.org/officeDocument/2006/math" xmlns:v="urn:schemas-microsoft-com:vml" xmlns:wp14="http://schemas.microsoft.com/office/word/2010/wordprocessingDrawing" xmlns:wp="http://schemas.openxmlformats.org/drawingml/2006/wordprocessingDrawing" xmlns:w10="urn:schemas-microsoft-com:office:word" xmlns:w="http://schemas.openxmlformats.org/wordprocessingml/2006/main" xmlns:w14="http://schemas.microsoft.com/office/word/2010/wordml" xmlns:w15="http://schemas.microsoft.com/office/word/2012/wordml" xmlns:w16cex="http://schemas.microsoft.com/office/word/2018/wordml/cex" xmlns:w16cid="http://schemas.microsoft.com/office/word/2016/wordml/cid" xmlns:w16="http://schemas.microsoft.com/office/word/2018/wordml" xmlns:w16sdtdh="http://schemas.microsoft.com/office/word/2020/wordml/sdtdatahash" xmlns:w16se="http://schemas.microsoft.com/office/word/2015/wordml/symex" xmlns:wpg="http://schemas.microsoft.com/office/word/2010/wordprocessingGroup" xmlns:wpi="http://schemas.microsoft.com/office/word/2010/wordprocessingInk" xmlns:wne="http://schemas.microsoft.com/office/word/2006/wordml" xmlns:wps="http://schemas.microsoft.com/office/word/2010/wordprocessingShape" mc:Ignorable="w14 w15 w16se w16cid w16 w16cex w16sdtdh wp14">
+<w:ftr xmlns:wpc="http://schemas.microsoft.com/office/word/2010/wordprocessingCanvas" xmlns:cx="http://schemas.microsoft.com/office/drawing/2014/chartex" xmlns:cx1="http://schemas.microsoft.com/office/drawing/2015/9/8/chartex" xmlns:cx2="http://schemas.microsoft.com/office/drawing/2015/10/21/chartex" xmlns:cx3="http://schemas.microsoft.com/office/drawing/2016/5/9/chartex" xmlns:cx4="http://schemas.microsoft.com/office/drawing/2016/5/10/chartex" xmlns:cx5="http://schemas.microsoft.com/office/drawing/2016/5/11/chartex" xmlns:cx6="http://schemas.microsoft.com/office/drawing/2016/5/12/chartex" xmlns:cx7="http://schemas.microsoft.com/office/drawing/2016/5/13/chartex" xmlns:cx8="http://schemas.microsoft.com/office/drawing/2016/5/14/chartex" xmlns:mc="http://schemas.openxmlformats.org/markup-compatibility/2006" xmlns:aink="http://schemas.microsoft.com/office/drawing/2016/ink" xmlns:am3d="http://schemas.microsoft.com/office/drawing/2017/model3d" xmlns:o="urn:schemas-microsoft-com:office:office" xmlns:oel="http://schemas.microsoft.com/office/2019/extlst" xmlns:r="http://schemas.openxmlformats.org/officeDocument/2006/relationships" xmlns:m="http://schemas.openxmlformats.org/officeDocument/2006/math" xmlns:v="urn:schemas-microsoft-com:vml" xmlns:wp14="http://schemas.microsoft.com/office/word/2010/wordprocessingDrawing" xmlns:wp="http://schemas.openxmlformats.org/drawingml/2006/wordprocessingDrawing" xmlns:w10="urn:schemas-microsoft-com:office:word" xmlns:w="http://schemas.openxmlformats.org/wordprocessingml/2006/main" xmlns:w14="http://schemas.microsoft.com/office/word/2010/wordml" xmlns:w15="http://schemas.microsoft.com/office/word/2012/wordml" xmlns:w16cei="http://schemas.microsoft.com/office/word/2026/wordml/cei" xmlns:w16cex="http://schemas.microsoft.com/office/word/2018/wordml/cex" xmlns:w16cid="http://schemas.microsoft.com/office/word/2016/wordml/cid" xmlns:w16="http://schemas.microsoft.com/office/word/2018/wordml" xmlns:w16du="http://schemas.microsoft.com/office/word/2023/wordml/word16du" xmlns:w16sdtdh="http://schemas.microsoft.com/office/word/2020/wordml/sdtdatahash" xmlns:w16sdtfl="http://schemas.microsoft.com/office/word/2024/wordml/sdtformatlock" xmlns:w16se="http://schemas.microsoft.com/office/word/2015/wordml/symex" xmlns:wpg="http://schemas.microsoft.com/office/word/2010/wordprocessingGroup" xmlns:wpi="http://schemas.microsoft.com/office/word/2010/wordprocessingInk" xmlns:wne="http://schemas.microsoft.com/office/word/2006/wordml" xmlns:wps="http://schemas.microsoft.com/office/word/2010/wordprocessingShape" mc:Ignorable="w14 w15 w16se w16cid w16 w16cex w16sdtdh w16sdtfl w16du wp14">
   <w:p>
     <w:pPr>
       <w:pStyle w:val="Footer"/>
@@ -6017,7 +5176,7 @@
 </file>
 
 <file path=word/footer4.xml><?xml version="1.0" encoding="utf-8"?>
-<w:ftr xmlns:wpc="http://schemas.microsoft.com/office/word/2010/wordprocessingCanvas" xmlns:cx="http://schemas.microsoft.com/office/drawing/2014/chartex" xmlns:cx1="http://schemas.microsoft.com/office/drawing/2015/9/8/chartex" xmlns:cx2="http://schemas.microsoft.com/office/drawing/2015/10/21/chartex" xmlns:cx3="http://schemas.microsoft.com/office/drawing/2016/5/9/chartex" xmlns:cx4="http://schemas.microsoft.com/office/drawing/2016/5/10/chartex" xmlns:cx5="http://schemas.microsoft.com/office/drawing/2016/5/11/chartex" xmlns:cx6="http://schemas.microsoft.com/office/drawing/2016/5/12/chartex" xmlns:cx7="http://schemas.microsoft.com/office/drawing/2016/5/13/chartex" xmlns:cx8="http://schemas.microsoft.com/office/drawing/2016/5/14/chartex" xmlns:mc="http://schemas.openxmlformats.org/markup-compatibility/2006" xmlns:aink="http://schemas.microsoft.com/office/drawing/2016/ink" xmlns:am3d="http://schemas.microsoft.com/office/drawing/2017/model3d" xmlns:o="urn:schemas-microsoft-com:office:office" xmlns:r="http://schemas.openxmlformats.org/officeDocument/2006/relationships" xmlns:m="http://schemas.openxmlformats.org/officeDocument/2006/math" xmlns:v="urn:schemas-microsoft-com:vml" xmlns:wp14="http://schemas.microsoft.com/office/word/2010/wordprocessingDrawing" xmlns:wp="http://schemas.openxmlformats.org/drawingml/2006/wordprocessingDrawing" xmlns:w10="urn:schemas-microsoft-com:office:word" xmlns:w="http://schemas.openxmlformats.org/wordprocessingml/2006/main" xmlns:w14="http://schemas.microsoft.com/office/word/2010/wordml" xmlns:w15="http://schemas.microsoft.com/office/word/2012/wordml" xmlns:w16cex="http://schemas.microsoft.com/office/word/2018/wordml/cex" xmlns:w16cid="http://schemas.microsoft.com/office/word/2016/wordml/cid" xmlns:w16="http://schemas.microsoft.com/office/word/2018/wordml" xmlns:w16sdtdh="http://schemas.microsoft.com/office/word/2020/wordml/sdtdatahash" xmlns:w16se="http://schemas.microsoft.com/office/word/2015/wordml/symex" xmlns:wpg="http://schemas.microsoft.com/office/word/2010/wordprocessingGroup" xmlns:wpi="http://schemas.microsoft.com/office/word/2010/wordprocessingInk" xmlns:wne="http://schemas.microsoft.com/office/word/2006/wordml" xmlns:wps="http://schemas.microsoft.com/office/word/2010/wordprocessingShape" mc:Ignorable="w14 w15 w16se w16cid w16 w16cex w16sdtdh wp14">
+<w:ftr xmlns:wpc="http://schemas.microsoft.com/office/word/2010/wordprocessingCanvas" xmlns:cx="http://schemas.microsoft.com/office/drawing/2014/chartex" xmlns:cx1="http://schemas.microsoft.com/office/drawing/2015/9/8/chartex" xmlns:cx2="http://schemas.microsoft.com/office/drawing/2015/10/21/chartex" xmlns:cx3="http://schemas.microsoft.com/office/drawing/2016/5/9/chartex" xmlns:cx4="http://schemas.microsoft.com/office/drawing/2016/5/10/chartex" xmlns:cx5="http://schemas.microsoft.com/office/drawing/2016/5/11/chartex" xmlns:cx6="http://schemas.microsoft.com/office/drawing/2016/5/12/chartex" xmlns:cx7="http://schemas.microsoft.com/office/drawing/2016/5/13/chartex" xmlns:cx8="http://schemas.microsoft.com/office/drawing/2016/5/14/chartex" xmlns:mc="http://schemas.openxmlformats.org/markup-compatibility/2006" xmlns:aink="http://schemas.microsoft.com/office/drawing/2016/ink" xmlns:am3d="http://schemas.microsoft.com/office/drawing/2017/model3d" xmlns:o="urn:schemas-microsoft-com:office:office" xmlns:oel="http://schemas.microsoft.com/office/2019/extlst" xmlns:r="http://schemas.openxmlformats.org/officeDocument/2006/relationships" xmlns:m="http://schemas.openxmlformats.org/officeDocument/2006/math" xmlns:v="urn:schemas-microsoft-com:vml" xmlns:wp14="http://schemas.microsoft.com/office/word/2010/wordprocessingDrawing" xmlns:wp="http://schemas.openxmlformats.org/drawingml/2006/wordprocessingDrawing" xmlns:w10="urn:schemas-microsoft-com:office:word" xmlns:w="http://schemas.openxmlformats.org/wordprocessingml/2006/main" xmlns:w14="http://schemas.microsoft.com/office/word/2010/wordml" xmlns:w15="http://schemas.microsoft.com/office/word/2012/wordml" xmlns:w16cei="http://schemas.microsoft.com/office/word/2026/wordml/cei" xmlns:w16cex="http://schemas.microsoft.com/office/word/2018/wordml/cex" xmlns:w16cid="http://schemas.microsoft.com/office/word/2016/wordml/cid" xmlns:w16="http://schemas.microsoft.com/office/word/2018/wordml" xmlns:w16du="http://schemas.microsoft.com/office/word/2023/wordml/word16du" xmlns:w16sdtdh="http://schemas.microsoft.com/office/word/2020/wordml/sdtdatahash" xmlns:w16sdtfl="http://schemas.microsoft.com/office/word/2024/wordml/sdtformatlock" xmlns:w16se="http://schemas.microsoft.com/office/word/2015/wordml/symex" xmlns:wpg="http://schemas.microsoft.com/office/word/2010/wordprocessingGroup" xmlns:wpi="http://schemas.microsoft.com/office/word/2010/wordprocessingInk" xmlns:wne="http://schemas.microsoft.com/office/word/2006/wordml" xmlns:wps="http://schemas.microsoft.com/office/word/2010/wordprocessingShape" mc:Ignorable="w14 w15 w16se w16cid w16 w16cex w16sdtdh w16sdtfl w16du wp14">
   <w:p>
     <w:pPr>
       <w:pStyle w:val="Footer"/>
@@ -6027,7 +5186,7 @@
 </file>
 
 <file path=word/footer5.xml><?xml version="1.0" encoding="utf-8"?>
-<w:ftr xmlns:wpc="http://schemas.microsoft.com/office/word/2010/wordprocessingCanvas" xmlns:cx="http://schemas.microsoft.com/office/drawing/2014/chartex" xmlns:cx1="http://schemas.microsoft.com/office/drawing/2015/9/8/chartex" xmlns:cx2="http://schemas.microsoft.com/office/drawing/2015/10/21/chartex" xmlns:cx3="http://schemas.microsoft.com/office/drawing/2016/5/9/chartex" xmlns:cx4="http://schemas.microsoft.com/office/drawing/2016/5/10/chartex" xmlns:cx5="http://schemas.microsoft.com/office/drawing/2016/5/11/chartex" xmlns:cx6="http://schemas.microsoft.com/office/drawing/2016/5/12/chartex" xmlns:cx7="http://schemas.microsoft.com/office/drawing/2016/5/13/chartex" xmlns:cx8="http://schemas.microsoft.com/office/drawing/2016/5/14/chartex" xmlns:mc="http://schemas.openxmlformats.org/markup-compatibility/2006" xmlns:aink="http://schemas.microsoft.com/office/drawing/2016/ink" xmlns:am3d="http://schemas.microsoft.com/office/drawing/2017/model3d" xmlns:o="urn:schemas-microsoft-com:office:office" xmlns:r="http://schemas.openxmlformats.org/officeDocument/2006/relationships" xmlns:m="http://schemas.openxmlformats.org/officeDocument/2006/math" xmlns:v="urn:schemas-microsoft-com:vml" xmlns:wp14="http://schemas.microsoft.com/office/word/2010/wordprocessingDrawing" xmlns:wp="http://schemas.openxmlformats.org/drawingml/2006/wordprocessingDrawing" xmlns:w10="urn:schemas-microsoft-com:office:word" xmlns:w="http://schemas.openxmlformats.org/wordprocessingml/2006/main" xmlns:w14="http://schemas.microsoft.com/office/word/2010/wordml" xmlns:w15="http://schemas.microsoft.com/office/word/2012/wordml" xmlns:w16cex="http://schemas.microsoft.com/office/word/2018/wordml/cex" xmlns:w16cid="http://schemas.microsoft.com/office/word/2016/wordml/cid" xmlns:w16="http://schemas.microsoft.com/office/word/2018/wordml" xmlns:w16sdtdh="http://schemas.microsoft.com/office/word/2020/wordml/sdtdatahash" xmlns:w16se="http://schemas.microsoft.com/office/word/2015/wordml/symex" xmlns:wpg="http://schemas.microsoft.com/office/word/2010/wordprocessingGroup" xmlns:wpi="http://schemas.microsoft.com/office/word/2010/wordprocessingInk" xmlns:wne="http://schemas.microsoft.com/office/word/2006/wordml" xmlns:wps="http://schemas.microsoft.com/office/word/2010/wordprocessingShape" mc:Ignorable="w14 w15 w16se w16cid w16 w16cex w16sdtdh wp14">
+<w:ftr xmlns:wpc="http://schemas.microsoft.com/office/word/2010/wordprocessingCanvas" xmlns:cx="http://schemas.microsoft.com/office/drawing/2014/chartex" xmlns:cx1="http://schemas.microsoft.com/office/drawing/2015/9/8/chartex" xmlns:cx2="http://schemas.microsoft.com/office/drawing/2015/10/21/chartex" xmlns:cx3="http://schemas.microsoft.com/office/drawing/2016/5/9/chartex" xmlns:cx4="http://schemas.microsoft.com/office/drawing/2016/5/10/chartex" xmlns:cx5="http://schemas.microsoft.com/office/drawing/2016/5/11/chartex" xmlns:cx6="http://schemas.microsoft.com/office/drawing/2016/5/12/chartex" xmlns:cx7="http://schemas.microsoft.com/office/drawing/2016/5/13/chartex" xmlns:cx8="http://schemas.microsoft.com/office/drawing/2016/5/14/chartex" xmlns:mc="http://schemas.openxmlformats.org/markup-compatibility/2006" xmlns:aink="http://schemas.microsoft.com/office/drawing/2016/ink" xmlns:am3d="http://schemas.microsoft.com/office/drawing/2017/model3d" xmlns:o="urn:schemas-microsoft-com:office:office" xmlns:oel="http://schemas.microsoft.com/office/2019/extlst" xmlns:r="http://schemas.openxmlformats.org/officeDocument/2006/relationships" xmlns:m="http://schemas.openxmlformats.org/officeDocument/2006/math" xmlns:v="urn:schemas-microsoft-com:vml" xmlns:wp14="http://schemas.microsoft.com/office/word/2010/wordprocessingDrawing" xmlns:wp="http://schemas.openxmlformats.org/drawingml/2006/wordprocessingDrawing" xmlns:w10="urn:schemas-microsoft-com:office:word" xmlns:w="http://schemas.openxmlformats.org/wordprocessingml/2006/main" xmlns:w14="http://schemas.microsoft.com/office/word/2010/wordml" xmlns:w15="http://schemas.microsoft.com/office/word/2012/wordml" xmlns:w16cei="http://schemas.microsoft.com/office/word/2026/wordml/cei" xmlns:w16cex="http://schemas.microsoft.com/office/word/2018/wordml/cex" xmlns:w16cid="http://schemas.microsoft.com/office/word/2016/wordml/cid" xmlns:w16="http://schemas.microsoft.com/office/word/2018/wordml" xmlns:w16du="http://schemas.microsoft.com/office/word/2023/wordml/word16du" xmlns:w16sdtdh="http://schemas.microsoft.com/office/word/2020/wordml/sdtdatahash" xmlns:w16sdtfl="http://schemas.microsoft.com/office/word/2024/wordml/sdtformatlock" xmlns:w16se="http://schemas.microsoft.com/office/word/2015/wordml/symex" xmlns:wpg="http://schemas.microsoft.com/office/word/2010/wordprocessingGroup" xmlns:wpi="http://schemas.microsoft.com/office/word/2010/wordprocessingInk" xmlns:wne="http://schemas.microsoft.com/office/word/2006/wordml" xmlns:wps="http://schemas.microsoft.com/office/word/2010/wordprocessingShape" mc:Ignorable="w14 w15 w16se w16cid w16 w16cex w16sdtdh w16sdtfl w16du wp14">
   <w:p>
     <w:pPr>
       <w:pStyle w:val="Footer"/>
@@ -6037,7 +5196,7 @@
 </file>
 
 <file path=word/footer6.xml><?xml version="1.0" encoding="utf-8"?>
-<w:ftr xmlns:wpc="http://schemas.microsoft.com/office/word/2010/wordprocessingCanvas" xmlns:cx="http://schemas.microsoft.com/office/drawing/2014/chartex" xmlns:cx1="http://schemas.microsoft.com/office/drawing/2015/9/8/chartex" xmlns:cx2="http://schemas.microsoft.com/office/drawing/2015/10/21/chartex" xmlns:cx3="http://schemas.microsoft.com/office/drawing/2016/5/9/chartex" xmlns:cx4="http://schemas.microsoft.com/office/drawing/2016/5/10/chartex" xmlns:cx5="http://schemas.microsoft.com/office/drawing/2016/5/11/chartex" xmlns:cx6="http://schemas.microsoft.com/office/drawing/2016/5/12/chartex" xmlns:cx7="http://schemas.microsoft.com/office/drawing/2016/5/13/chartex" xmlns:cx8="http://schemas.microsoft.com/office/drawing/2016/5/14/chartex" xmlns:mc="http://schemas.openxmlformats.org/markup-compatibility/2006" xmlns:aink="http://schemas.microsoft.com/office/drawing/2016/ink" xmlns:am3d="http://schemas.microsoft.com/office/drawing/2017/model3d" xmlns:o="urn:schemas-microsoft-com:office:office" xmlns:r="http://schemas.openxmlformats.org/officeDocument/2006/relationships" xmlns:m="http://schemas.openxmlformats.org/officeDocument/2006/math" xmlns:v="urn:schemas-microsoft-com:vml" xmlns:wp14="http://schemas.microsoft.com/office/word/2010/wordprocessingDrawing" xmlns:wp="http://schemas.openxmlformats.org/drawingml/2006/wordprocessingDrawing" xmlns:w10="urn:schemas-microsoft-com:office:word" xmlns:w="http://schemas.openxmlformats.org/wordprocessingml/2006/main" xmlns:w14="http://schemas.microsoft.com/office/word/2010/wordml" xmlns:w15="http://schemas.microsoft.com/office/word/2012/wordml" xmlns:w16cex="http://schemas.microsoft.com/office/word/2018/wordml/cex" xmlns:w16cid="http://schemas.microsoft.com/office/word/2016/wordml/cid" xmlns:w16="http://schemas.microsoft.com/office/word/2018/wordml" xmlns:w16sdtdh="http://schemas.microsoft.com/office/word/2020/wordml/sdtdatahash" xmlns:w16se="http://schemas.microsoft.com/office/word/2015/wordml/symex" xmlns:wpg="http://schemas.microsoft.com/office/word/2010/wordprocessingGroup" xmlns:wpi="http://schemas.microsoft.com/office/word/2010/wordprocessingInk" xmlns:wne="http://schemas.microsoft.com/office/word/2006/wordml" xmlns:wps="http://schemas.microsoft.com/office/word/2010/wordprocessingShape" mc:Ignorable="w14 w15 w16se w16cid w16 w16cex w16sdtdh wp14">
+<w:ftr xmlns:wpc="http://schemas.microsoft.com/office/word/2010/wordprocessingCanvas" xmlns:cx="http://schemas.microsoft.com/office/drawing/2014/chartex" xmlns:cx1="http://schemas.microsoft.com/office/drawing/2015/9/8/chartex" xmlns:cx2="http://schemas.microsoft.com/office/drawing/2015/10/21/chartex" xmlns:cx3="http://schemas.microsoft.com/office/drawing/2016/5/9/chartex" xmlns:cx4="http://schemas.microsoft.com/office/drawing/2016/5/10/chartex" xmlns:cx5="http://schemas.microsoft.com/office/drawing/2016/5/11/chartex" xmlns:cx6="http://schemas.microsoft.com/office/drawing/2016/5/12/chartex" xmlns:cx7="http://schemas.microsoft.com/office/drawing/2016/5/13/chartex" xmlns:cx8="http://schemas.microsoft.com/office/drawing/2016/5/14/chartex" xmlns:mc="http://schemas.openxmlformats.org/markup-compatibility/2006" xmlns:aink="http://schemas.microsoft.com/office/drawing/2016/ink" xmlns:am3d="http://schemas.microsoft.com/office/drawing/2017/model3d" xmlns:o="urn:schemas-microsoft-com:office:office" xmlns:oel="http://schemas.microsoft.com/office/2019/extlst" xmlns:r="http://schemas.openxmlformats.org/officeDocument/2006/relationships" xmlns:m="http://schemas.openxmlformats.org/officeDocument/2006/math" xmlns:v="urn:schemas-microsoft-com:vml" xmlns:wp14="http://schemas.microsoft.com/office/word/2010/wordprocessingDrawing" xmlns:wp="http://schemas.openxmlformats.org/drawingml/2006/wordprocessingDrawing" xmlns:w10="urn:schemas-microsoft-com:office:word" xmlns:w="http://schemas.openxmlformats.org/wordprocessingml/2006/main" xmlns:w14="http://schemas.microsoft.com/office/word/2010/wordml" xmlns:w15="http://schemas.microsoft.com/office/word/2012/wordml" xmlns:w16cei="http://schemas.microsoft.com/office/word/2026/wordml/cei" xmlns:w16cex="http://schemas.microsoft.com/office/word/2018/wordml/cex" xmlns:w16cid="http://schemas.microsoft.com/office/word/2016/wordml/cid" xmlns:w16="http://schemas.microsoft.com/office/word/2018/wordml" xmlns:w16du="http://schemas.microsoft.com/office/word/2023/wordml/word16du" xmlns:w16sdtdh="http://schemas.microsoft.com/office/word/2020/wordml/sdtdatahash" xmlns:w16sdtfl="http://schemas.microsoft.com/office/word/2024/wordml/sdtformatlock" xmlns:w16se="http://schemas.microsoft.com/office/word/2015/wordml/symex" xmlns:wpg="http://schemas.microsoft.com/office/word/2010/wordprocessingGroup" xmlns:wpi="http://schemas.microsoft.com/office/word/2010/wordprocessingInk" xmlns:wne="http://schemas.microsoft.com/office/word/2006/wordml" xmlns:wps="http://schemas.microsoft.com/office/word/2010/wordprocessingShape" mc:Ignorable="w14 w15 w16se w16cid w16 w16cex w16sdtdh w16sdtfl w16du wp14">
   <w:p>
     <w:pPr>
       <w:pStyle w:val="Footer"/>
@@ -6047,7 +5206,7 @@
 </file>
 
 <file path=word/footer7.xml><?xml version="1.0" encoding="utf-8"?>
-<w:ftr xmlns:wpc="http://schemas.microsoft.com/office/word/2010/wordprocessingCanvas" xmlns:cx="http://schemas.microsoft.com/office/drawing/2014/chartex" xmlns:cx1="http://schemas.microsoft.com/office/drawing/2015/9/8/chartex" xmlns:cx2="http://schemas.microsoft.com/office/drawing/2015/10/21/chartex" xmlns:cx3="http://schemas.microsoft.com/office/drawing/2016/5/9/chartex" xmlns:cx4="http://schemas.microsoft.com/office/drawing/2016/5/10/chartex" xmlns:cx5="http://schemas.microsoft.com/office/drawing/2016/5/11/chartex" xmlns:cx6="http://schemas.microsoft.com/office/drawing/2016/5/12/chartex" xmlns:cx7="http://schemas.microsoft.com/office/drawing/2016/5/13/chartex" xmlns:cx8="http://schemas.microsoft.com/office/drawing/2016/5/14/chartex" xmlns:mc="http://schemas.openxmlformats.org/markup-compatibility/2006" xmlns:aink="http://schemas.microsoft.com/office/drawing/2016/ink" xmlns:am3d="http://schemas.microsoft.com/office/drawing/2017/model3d" xmlns:o="urn:schemas-microsoft-com:office:office" xmlns:r="http://schemas.openxmlformats.org/officeDocument/2006/relationships" xmlns:m="http://schemas.openxmlformats.org/officeDocument/2006/math" xmlns:v="urn:schemas-microsoft-com:vml" xmlns:wp14="http://schemas.microsoft.com/office/word/2010/wordprocessingDrawing" xmlns:wp="http://schemas.openxmlformats.org/drawingml/2006/wordprocessingDrawing" xmlns:w10="urn:schemas-microsoft-com:office:word" xmlns:w="http://schemas.openxmlformats.org/wordprocessingml/2006/main" xmlns:w14="http://schemas.microsoft.com/office/word/2010/wordml" xmlns:w15="http://schemas.microsoft.com/office/word/2012/wordml" xmlns:w16cex="http://schemas.microsoft.com/office/word/2018/wordml/cex" xmlns:w16cid="http://schemas.microsoft.com/office/word/2016/wordml/cid" xmlns:w16="http://schemas.microsoft.com/office/word/2018/wordml" xmlns:w16sdtdh="http://schemas.microsoft.com/office/word/2020/wordml/sdtdatahash" xmlns:w16se="http://schemas.microsoft.com/office/word/2015/wordml/symex" xmlns:wpg="http://schemas.microsoft.com/office/word/2010/wordprocessingGroup" xmlns:wpi="http://schemas.microsoft.com/office/word/2010/wordprocessingInk" xmlns:wne="http://schemas.microsoft.com/office/word/2006/wordml" xmlns:wps="http://schemas.microsoft.com/office/word/2010/wordprocessingShape" mc:Ignorable="w14 w15 w16se w16cid w16 w16cex w16sdtdh wp14">
+<w:ftr xmlns:wpc="http://schemas.microsoft.com/office/word/2010/wordprocessingCanvas" xmlns:cx="http://schemas.microsoft.com/office/drawing/2014/chartex" xmlns:cx1="http://schemas.microsoft.com/office/drawing/2015/9/8/chartex" xmlns:cx2="http://schemas.microsoft.com/office/drawing/2015/10/21/chartex" xmlns:cx3="http://schemas.microsoft.com/office/drawing/2016/5/9/chartex" xmlns:cx4="http://schemas.microsoft.com/office/drawing/2016/5/10/chartex" xmlns:cx5="http://schemas.microsoft.com/office/drawing/2016/5/11/chartex" xmlns:cx6="http://schemas.microsoft.com/office/drawing/2016/5/12/chartex" xmlns:cx7="http://schemas.microsoft.com/office/drawing/2016/5/13/chartex" xmlns:cx8="http://schemas.microsoft.com/office/drawing/2016/5/14/chartex" xmlns:mc="http://schemas.openxmlformats.org/markup-compatibility/2006" xmlns:aink="http://schemas.microsoft.com/office/drawing/2016/ink" xmlns:am3d="http://schemas.microsoft.com/office/drawing/2017/model3d" xmlns:o="urn:schemas-microsoft-com:office:office" xmlns:oel="http://schemas.microsoft.com/office/2019/extlst" xmlns:r="http://schemas.openxmlformats.org/officeDocument/2006/relationships" xmlns:m="http://schemas.openxmlformats.org/officeDocument/2006/math" xmlns:v="urn:schemas-microsoft-com:vml" xmlns:wp14="http://schemas.microsoft.com/office/word/2010/wordprocessingDrawing" xmlns:wp="http://schemas.openxmlformats.org/drawingml/2006/wordprocessingDrawing" xmlns:w10="urn:schemas-microsoft-com:office:word" xmlns:w="http://schemas.openxmlformats.org/wordprocessingml/2006/main" xmlns:w14="http://schemas.microsoft.com/office/word/2010/wordml" xmlns:w15="http://schemas.microsoft.com/office/word/2012/wordml" xmlns:w16cei="http://schemas.microsoft.com/office/word/2026/wordml/cei" xmlns:w16cex="http://schemas.microsoft.com/office/word/2018/wordml/cex" xmlns:w16cid="http://schemas.microsoft.com/office/word/2016/wordml/cid" xmlns:w16="http://schemas.microsoft.com/office/word/2018/wordml" xmlns:w16du="http://schemas.microsoft.com/office/word/2023/wordml/word16du" xmlns:w16sdtdh="http://schemas.microsoft.com/office/word/2020/wordml/sdtdatahash" xmlns:w16sdtfl="http://schemas.microsoft.com/office/word/2024/wordml/sdtformatlock" xmlns:w16se="http://schemas.microsoft.com/office/word/2015/wordml/symex" xmlns:wpg="http://schemas.microsoft.com/office/word/2010/wordprocessingGroup" xmlns:wpi="http://schemas.microsoft.com/office/word/2010/wordprocessingInk" xmlns:wne="http://schemas.microsoft.com/office/word/2006/wordml" xmlns:wps="http://schemas.microsoft.com/office/word/2010/wordprocessingShape" mc:Ignorable="w14 w15 w16se w16cid w16 w16cex w16sdtdh w16sdtfl w16du wp14">
   <w:p>
     <w:pPr>
       <w:pStyle w:val="Footer"/>
@@ -6057,7 +5216,7 @@
 </file>
 
 <file path=word/footer8.xml><?xml version="1.0" encoding="utf-8"?>
-<w:ftr xmlns:wpc="http://schemas.microsoft.com/office/word/2010/wordprocessingCanvas" xmlns:cx="http://schemas.microsoft.com/office/drawing/2014/chartex" xmlns:cx1="http://schemas.microsoft.com/office/drawing/2015/9/8/chartex" xmlns:cx2="http://schemas.microsoft.com/office/drawing/2015/10/21/chartex" xmlns:cx3="http://schemas.microsoft.com/office/drawing/2016/5/9/chartex" xmlns:cx4="http://schemas.microsoft.com/office/drawing/2016/5/10/chartex" xmlns:cx5="http://schemas.microsoft.com/office/drawing/2016/5/11/chartex" xmlns:cx6="http://schemas.microsoft.com/office/drawing/2016/5/12/chartex" xmlns:cx7="http://schemas.microsoft.com/office/drawing/2016/5/13/chartex" xmlns:cx8="http://schemas.microsoft.com/office/drawing/2016/5/14/chartex" xmlns:mc="http://schemas.openxmlformats.org/markup-compatibility/2006" xmlns:aink="http://schemas.microsoft.com/office/drawing/2016/ink" xmlns:am3d="http://schemas.microsoft.com/office/drawing/2017/model3d" xmlns:o="urn:schemas-microsoft-com:office:office" xmlns:r="http://schemas.openxmlformats.org/officeDocument/2006/relationships" xmlns:m="http://schemas.openxmlformats.org/officeDocument/2006/math" xmlns:v="urn:schemas-microsoft-com:vml" xmlns:wp14="http://schemas.microsoft.com/office/word/2010/wordprocessingDrawing" xmlns:wp="http://schemas.openxmlformats.org/drawingml/2006/wordprocessingDrawing" xmlns:w10="urn:schemas-microsoft-com:office:word" xmlns:w="http://schemas.openxmlformats.org/wordprocessingml/2006/main" xmlns:w14="http://schemas.microsoft.com/office/word/2010/wordml" xmlns:w15="http://schemas.microsoft.com/office/word/2012/wordml" xmlns:w16cex="http://schemas.microsoft.com/office/word/2018/wordml/cex" xmlns:w16cid="http://schemas.microsoft.com/office/word/2016/wordml/cid" xmlns:w16="http://schemas.microsoft.com/office/word/2018/wordml" xmlns:w16sdtdh="http://schemas.microsoft.com/office/word/2020/wordml/sdtdatahash" xmlns:w16se="http://schemas.microsoft.com/office/word/2015/wordml/symex" xmlns:wpg="http://schemas.microsoft.com/office/word/2010/wordprocessingGroup" xmlns:wpi="http://schemas.microsoft.com/office/word/2010/wordprocessingInk" xmlns:wne="http://schemas.microsoft.com/office/word/2006/wordml" xmlns:wps="http://schemas.microsoft.com/office/word/2010/wordprocessingShape" mc:Ignorable="w14 w15 w16se w16cid w16 w16cex w16sdtdh wp14">
+<w:ftr xmlns:wpc="http://schemas.microsoft.com/office/word/2010/wordprocessingCanvas" xmlns:cx="http://schemas.microsoft.com/office/drawing/2014/chartex" xmlns:cx1="http://schemas.microsoft.com/office/drawing/2015/9/8/chartex" xmlns:cx2="http://schemas.microsoft.com/office/drawing/2015/10/21/chartex" xmlns:cx3="http://schemas.microsoft.com/office/drawing/2016/5/9/chartex" xmlns:cx4="http://schemas.microsoft.com/office/drawing/2016/5/10/chartex" xmlns:cx5="http://schemas.microsoft.com/office/drawing/2016/5/11/chartex" xmlns:cx6="http://schemas.microsoft.com/office/drawing/2016/5/12/chartex" xmlns:cx7="http://schemas.microsoft.com/office/drawing/2016/5/13/chartex" xmlns:cx8="http://schemas.microsoft.com/office/drawing/2016/5/14/chartex" xmlns:mc="http://schemas.openxmlformats.org/markup-compatibility/2006" xmlns:aink="http://schemas.microsoft.com/office/drawing/2016/ink" xmlns:am3d="http://schemas.microsoft.com/office/drawing/2017/model3d" xmlns:o="urn:schemas-microsoft-com:office:office" xmlns:oel="http://schemas.microsoft.com/office/2019/extlst" xmlns:r="http://schemas.openxmlformats.org/officeDocument/2006/relationships" xmlns:m="http://schemas.openxmlformats.org/officeDocument/2006/math" xmlns:v="urn:schemas-microsoft-com:vml" xmlns:wp14="http://schemas.microsoft.com/office/word/2010/wordprocessingDrawing" xmlns:wp="http://schemas.openxmlformats.org/drawingml/2006/wordprocessingDrawing" xmlns:w10="urn:schemas-microsoft-com:office:word" xmlns:w="http://schemas.openxmlformats.org/wordprocessingml/2006/main" xmlns:w14="http://schemas.microsoft.com/office/word/2010/wordml" xmlns:w15="http://schemas.microsoft.com/office/word/2012/wordml" xmlns:w16cei="http://schemas.microsoft.com/office/word/2026/wordml/cei" xmlns:w16cex="http://schemas.microsoft.com/office/word/2018/wordml/cex" xmlns:w16cid="http://schemas.microsoft.com/office/word/2016/wordml/cid" xmlns:w16="http://schemas.microsoft.com/office/word/2018/wordml" xmlns:w16du="http://schemas.microsoft.com/office/word/2023/wordml/word16du" xmlns:w16sdtdh="http://schemas.microsoft.com/office/word/2020/wordml/sdtdatahash" xmlns:w16sdtfl="http://schemas.microsoft.com/office/word/2024/wordml/sdtformatlock" xmlns:w16se="http://schemas.microsoft.com/office/word/2015/wordml/symex" xmlns:wpg="http://schemas.microsoft.com/office/word/2010/wordprocessingGroup" xmlns:wpi="http://schemas.microsoft.com/office/word/2010/wordprocessingInk" xmlns:wne="http://schemas.microsoft.com/office/word/2006/wordml" xmlns:wps="http://schemas.microsoft.com/office/word/2010/wordprocessingShape" mc:Ignorable="w14 w15 w16se w16cid w16 w16cex w16sdtdh w16sdtfl w16du wp14">
   <w:p>
     <w:pPr>
       <w:pStyle w:val="Footer"/>
@@ -6067,7 +5226,7 @@
 </file>
 
 <file path=word/footer9.xml><?xml version="1.0" encoding="utf-8"?>
-<w:ftr xmlns:wpc="http://schemas.microsoft.com/office/word/2010/wordprocessingCanvas" xmlns:cx="http://schemas.microsoft.com/office/drawing/2014/chartex" xmlns:cx1="http://schemas.microsoft.com/office/drawing/2015/9/8/chartex" xmlns:cx2="http://schemas.microsoft.com/office/drawing/2015/10/21/chartex" xmlns:cx3="http://schemas.microsoft.com/office/drawing/2016/5/9/chartex" xmlns:cx4="http://schemas.microsoft.com/office/drawing/2016/5/10/chartex" xmlns:cx5="http://schemas.microsoft.com/office/drawing/2016/5/11/chartex" xmlns:cx6="http://schemas.microsoft.com/office/drawing/2016/5/12/chartex" xmlns:cx7="http://schemas.microsoft.com/office/drawing/2016/5/13/chartex" xmlns:cx8="http://schemas.microsoft.com/office/drawing/2016/5/14/chartex" xmlns:mc="http://schemas.openxmlformats.org/markup-compatibility/2006" xmlns:aink="http://schemas.microsoft.com/office/drawing/2016/ink" xmlns:am3d="http://schemas.microsoft.com/office/drawing/2017/model3d" xmlns:o="urn:schemas-microsoft-com:office:office" xmlns:r="http://schemas.openxmlformats.org/officeDocument/2006/relationships" xmlns:m="http://schemas.openxmlformats.org/officeDocument/2006/math" xmlns:v="urn:schemas-microsoft-com:vml" xmlns:wp14="http://schemas.microsoft.com/office/word/2010/wordprocessingDrawing" xmlns:wp="http://schemas.openxmlformats.org/drawingml/2006/wordprocessingDrawing" xmlns:w10="urn:schemas-microsoft-com:office:word" xmlns:w="http://schemas.openxmlformats.org/wordprocessingml/2006/main" xmlns:w14="http://schemas.microsoft.com/office/word/2010/wordml" xmlns:w15="http://schemas.microsoft.com/office/word/2012/wordml" xmlns:w16cex="http://schemas.microsoft.com/office/word/2018/wordml/cex" xmlns:w16cid="http://schemas.microsoft.com/office/word/2016/wordml/cid" xmlns:w16="http://schemas.microsoft.com/office/word/2018/wordml" xmlns:w16sdtdh="http://schemas.microsoft.com/office/word/2020/wordml/sdtdatahash" xmlns:w16se="http://schemas.microsoft.com/office/word/2015/wordml/symex" xmlns:wpg="http://schemas.microsoft.com/office/word/2010/wordprocessingGroup" xmlns:wpi="http://schemas.microsoft.com/office/word/2010/wordprocessingInk" xmlns:wne="http://schemas.microsoft.com/office/word/2006/wordml" xmlns:wps="http://schemas.microsoft.com/office/word/2010/wordprocessingShape" mc:Ignorable="w14 w15 w16se w16cid w16 w16cex w16sdtdh wp14">
+<w:ftr xmlns:wpc="http://schemas.microsoft.com/office/word/2010/wordprocessingCanvas" xmlns:cx="http://schemas.microsoft.com/office/drawing/2014/chartex" xmlns:cx1="http://schemas.microsoft.com/office/drawing/2015/9/8/chartex" xmlns:cx2="http://schemas.microsoft.com/office/drawing/2015/10/21/chartex" xmlns:cx3="http://schemas.microsoft.com/office/drawing/2016/5/9/chartex" xmlns:cx4="http://schemas.microsoft.com/office/drawing/2016/5/10/chartex" xmlns:cx5="http://schemas.microsoft.com/office/drawing/2016/5/11/chartex" xmlns:cx6="http://schemas.microsoft.com/office/drawing/2016/5/12/chartex" xmlns:cx7="http://schemas.microsoft.com/office/drawing/2016/5/13/chartex" xmlns:cx8="http://schemas.microsoft.com/office/drawing/2016/5/14/chartex" xmlns:mc="http://schemas.openxmlformats.org/markup-compatibility/2006" xmlns:aink="http://schemas.microsoft.com/office/drawing/2016/ink" xmlns:am3d="http://schemas.microsoft.com/office/drawing/2017/model3d" xmlns:o="urn:schemas-microsoft-com:office:office" xmlns:oel="http://schemas.microsoft.com/office/2019/extlst" xmlns:r="http://schemas.openxmlformats.org/officeDocument/2006/relationships" xmlns:m="http://schemas.openxmlformats.org/officeDocument/2006/math" xmlns:v="urn:schemas-microsoft-com:vml" xmlns:wp14="http://schemas.microsoft.com/office/word/2010/wordprocessingDrawing" xmlns:wp="http://schemas.openxmlformats.org/drawingml/2006/wordprocessingDrawing" xmlns:w10="urn:schemas-microsoft-com:office:word" xmlns:w="http://schemas.openxmlformats.org/wordprocessingml/2006/main" xmlns:w14="http://schemas.microsoft.com/office/word/2010/wordml" xmlns:w15="http://schemas.microsoft.com/office/word/2012/wordml" xmlns:w16cei="http://schemas.microsoft.com/office/word/2026/wordml/cei" xmlns:w16cex="http://schemas.microsoft.com/office/word/2018/wordml/cex" xmlns:w16cid="http://schemas.microsoft.com/office/word/2016/wordml/cid" xmlns:w16="http://schemas.microsoft.com/office/word/2018/wordml" xmlns:w16du="http://schemas.microsoft.com/office/word/2023/wordml/word16du" xmlns:w16sdtdh="http://schemas.microsoft.com/office/word/2020/wordml/sdtdatahash" xmlns:w16sdtfl="http://schemas.microsoft.com/office/word/2024/wordml/sdtformatlock" xmlns:w16se="http://schemas.microsoft.com/office/word/2015/wordml/symex" xmlns:wpg="http://schemas.microsoft.com/office/word/2010/wordprocessingGroup" xmlns:wpi="http://schemas.microsoft.com/office/word/2010/wordprocessingInk" xmlns:wne="http://schemas.microsoft.com/office/word/2006/wordml" xmlns:wps="http://schemas.microsoft.com/office/word/2010/wordprocessingShape" mc:Ignorable="w14 w15 w16se w16cid w16 w16cex w16sdtdh w16sdtfl w16du wp14">
   <w:p>
     <w:pPr>
       <w:pStyle w:val="Footer"/>
@@ -6077,7 +5236,7 @@
 </file>
 
 <file path=word/footnotes.xml><?xml version="1.0" encoding="utf-8"?>
-<w:footnotes xmlns:wpc="http://schemas.microsoft.com/office/word/2010/wordprocessingCanvas" xmlns:cx="http://schemas.microsoft.com/office/drawing/2014/chartex" xmlns:cx1="http://schemas.microsoft.com/office/drawing/2015/9/8/chartex" xmlns:cx2="http://schemas.microsoft.com/office/drawing/2015/10/21/chartex" xmlns:cx3="http://schemas.microsoft.com/office/drawing/2016/5/9/chartex" xmlns:cx4="http://schemas.microsoft.com/office/drawing/2016/5/10/chartex" xmlns:cx5="http://schemas.microsoft.com/office/drawing/2016/5/11/chartex" xmlns:cx6="http://schemas.microsoft.com/office/drawing/2016/5/12/chartex" xmlns:cx7="http://schemas.microsoft.com/office/drawing/2016/5/13/chartex" xmlns:cx8="http://schemas.microsoft.com/office/drawing/2016/5/14/chartex" xmlns:mc="http://schemas.openxmlformats.org/markup-compatibility/2006" xmlns:aink="http://schemas.microsoft.com/office/drawing/2016/ink" xmlns:am3d="http://schemas.microsoft.com/office/drawing/2017/model3d" xmlns:o="urn:schemas-microsoft-com:office:office" xmlns:r="http://schemas.openxmlformats.org/officeDocument/2006/relationships" xmlns:m="http://schemas.openxmlformats.org/officeDocument/2006/math" xmlns:v="urn:schemas-microsoft-com:vml" xmlns:wp14="http://schemas.microsoft.com/office/word/2010/wordprocessingDrawing" xmlns:wp="http://schemas.openxmlformats.org/drawingml/2006/wordprocessingDrawing" xmlns:w10="urn:schemas-microsoft-com:office:word" xmlns:w="http://schemas.openxmlformats.org/wordprocessingml/2006/main" xmlns:w14="http://schemas.microsoft.com/office/word/2010/wordml" xmlns:w15="http://schemas.microsoft.com/office/word/2012/wordml" xmlns:w16cex="http://schemas.microsoft.com/office/word/2018/wordml/cex" xmlns:w16cid="http://schemas.microsoft.com/office/word/2016/wordml/cid" xmlns:w16="http://schemas.microsoft.com/office/word/2018/wordml" xmlns:w16sdtdh="http://schemas.microsoft.com/office/word/2020/wordml/sdtdatahash" xmlns:w16se="http://schemas.microsoft.com/office/word/2015/wordml/symex" xmlns:wpg="http://schemas.microsoft.com/office/word/2010/wordprocessingGroup" xmlns:wpi="http://schemas.microsoft.com/office/word/2010/wordprocessingInk" xmlns:wne="http://schemas.microsoft.com/office/word/2006/wordml" xmlns:wps="http://schemas.microsoft.com/office/word/2010/wordprocessingShape" mc:Ignorable="w14 w15 w16se w16cid w16 w16cex w16sdtdh wp14">
+<w:footnotes xmlns:wpc="http://schemas.microsoft.com/office/word/2010/wordprocessingCanvas" xmlns:cx="http://schemas.microsoft.com/office/drawing/2014/chartex" xmlns:cx1="http://schemas.microsoft.com/office/drawing/2015/9/8/chartex" xmlns:cx2="http://schemas.microsoft.com/office/drawing/2015/10/21/chartex" xmlns:cx3="http://schemas.microsoft.com/office/drawing/2016/5/9/chartex" xmlns:cx4="http://schemas.microsoft.com/office/drawing/2016/5/10/chartex" xmlns:cx5="http://schemas.microsoft.com/office/drawing/2016/5/11/chartex" xmlns:cx6="http://schemas.microsoft.com/office/drawing/2016/5/12/chartex" xmlns:cx7="http://schemas.microsoft.com/office/drawing/2016/5/13/chartex" xmlns:cx8="http://schemas.microsoft.com/office/drawing/2016/5/14/chartex" xmlns:mc="http://schemas.openxmlformats.org/markup-compatibility/2006" xmlns:aink="http://schemas.microsoft.com/office/drawing/2016/ink" xmlns:am3d="http://schemas.microsoft.com/office/drawing/2017/model3d" xmlns:o="urn:schemas-microsoft-com:office:office" xmlns:oel="http://schemas.microsoft.com/office/2019/extlst" xmlns:r="http://schemas.openxmlformats.org/officeDocument/2006/relationships" xmlns:m="http://schemas.openxmlformats.org/officeDocument/2006/math" xmlns:v="urn:schemas-microsoft-com:vml" xmlns:wp14="http://schemas.microsoft.com/office/word/2010/wordprocessingDrawing" xmlns:wp="http://schemas.openxmlformats.org/drawingml/2006/wordprocessingDrawing" xmlns:w10="urn:schemas-microsoft-com:office:word" xmlns:w="http://schemas.openxmlformats.org/wordprocessingml/2006/main" xmlns:w14="http://schemas.microsoft.com/office/word/2010/wordml" xmlns:w15="http://schemas.microsoft.com/office/word/2012/wordml" xmlns:w16cei="http://schemas.microsoft.com/office/word/2026/wordml/cei" xmlns:w16cex="http://schemas.microsoft.com/office/word/2018/wordml/cex" xmlns:w16cid="http://schemas.microsoft.com/office/word/2016/wordml/cid" xmlns:w16="http://schemas.microsoft.com/office/word/2018/wordml" xmlns:w16du="http://schemas.microsoft.com/office/word/2023/wordml/word16du" xmlns:w16sdtdh="http://schemas.microsoft.com/office/word/2020/wordml/sdtdatahash" xmlns:w16sdtfl="http://schemas.microsoft.com/office/word/2024/wordml/sdtformatlock" xmlns:w16se="http://schemas.microsoft.com/office/word/2015/wordml/symex" xmlns:wpg="http://schemas.microsoft.com/office/word/2010/wordprocessingGroup" xmlns:wpi="http://schemas.microsoft.com/office/word/2010/wordprocessingInk" xmlns:wne="http://schemas.microsoft.com/office/word/2006/wordml" xmlns:wps="http://schemas.microsoft.com/office/word/2010/wordprocessingShape" mc:Ignorable="w14 w15 w16se w16cid w16 w16cex w16sdtdh w16sdtfl w16du wp14">
   <w:footnote w:type="separator" w:id="-1">
     <w:p>
       <w:pPr>
@@ -6102,7 +5261,7 @@
 </file>
 
 <file path=word/header1.xml><?xml version="1.0" encoding="utf-8"?>
-<w:hdr xmlns:wpc="http://schemas.microsoft.com/office/word/2010/wordprocessingCanvas" xmlns:cx="http://schemas.microsoft.com/office/drawing/2014/chartex" xmlns:cx1="http://schemas.microsoft.com/office/drawing/2015/9/8/chartex" xmlns:cx2="http://schemas.microsoft.com/office/drawing/2015/10/21/chartex" xmlns:cx3="http://schemas.microsoft.com/office/drawing/2016/5/9/chartex" xmlns:cx4="http://schemas.microsoft.com/office/drawing/2016/5/10/chartex" xmlns:cx5="http://schemas.microsoft.com/office/drawing/2016/5/11/chartex" xmlns:cx6="http://schemas.microsoft.com/office/drawing/2016/5/12/chartex" xmlns:cx7="http://schemas.microsoft.com/office/drawing/2016/5/13/chartex" xmlns:cx8="http://schemas.microsoft.com/office/drawing/2016/5/14/chartex" xmlns:mc="http://schemas.openxmlformats.org/markup-compatibility/2006" xmlns:aink="http://schemas.microsoft.com/office/drawing/2016/ink" xmlns:am3d="http://schemas.microsoft.com/office/drawing/2017/model3d" xmlns:o="urn:schemas-microsoft-com:office:office" xmlns:r="http://schemas.openxmlformats.org/officeDocument/2006/relationships" xmlns:m="http://schemas.openxmlformats.org/officeDocument/2006/math" xmlns:v="urn:schemas-microsoft-com:vml" xmlns:wp14="http://schemas.microsoft.com/office/word/2010/wordprocessingDrawing" xmlns:wp="http://schemas.openxmlformats.org/drawingml/2006/wordprocessingDrawing" xmlns:w10="urn:schemas-microsoft-com:office:word" xmlns:w="http://schemas.openxmlformats.org/wordprocessingml/2006/main" xmlns:w14="http://schemas.microsoft.com/office/word/2010/wordml" xmlns:w15="http://schemas.microsoft.com/office/word/2012/wordml" xmlns:w16cex="http://schemas.microsoft.com/office/word/2018/wordml/cex" xmlns:w16cid="http://schemas.microsoft.com/office/word/2016/wordml/cid" xmlns:w16="http://schemas.microsoft.com/office/word/2018/wordml" xmlns:w16sdtdh="http://schemas.microsoft.com/office/word/2020/wordml/sdtdatahash" xmlns:w16se="http://schemas.microsoft.com/office/word/2015/wordml/symex" xmlns:wpg="http://schemas.microsoft.com/office/word/2010/wordprocessingGroup" xmlns:wpi="http://schemas.microsoft.com/office/word/2010/wordprocessingInk" xmlns:wne="http://schemas.microsoft.com/office/word/2006/wordml" xmlns:wps="http://schemas.microsoft.com/office/word/2010/wordprocessingShape" mc:Ignorable="w14 w15 w16se w16cid w16 w16cex w16sdtdh wp14">
+<w:hdr xmlns:wpc="http://schemas.microsoft.com/office/word/2010/wordprocessingCanvas" xmlns:cx="http://schemas.microsoft.com/office/drawing/2014/chartex" xmlns:cx1="http://schemas.microsoft.com/office/drawing/2015/9/8/chartex" xmlns:cx2="http://schemas.microsoft.com/office/drawing/2015/10/21/chartex" xmlns:cx3="http://schemas.microsoft.com/office/drawing/2016/5/9/chartex" xmlns:cx4="http://schemas.microsoft.com/office/drawing/2016/5/10/chartex" xmlns:cx5="http://schemas.microsoft.com/office/drawing/2016/5/11/chartex" xmlns:cx6="http://schemas.microsoft.com/office/drawing/2016/5/12/chartex" xmlns:cx7="http://schemas.microsoft.com/office/drawing/2016/5/13/chartex" xmlns:cx8="http://schemas.microsoft.com/office/drawing/2016/5/14/chartex" xmlns:mc="http://schemas.openxmlformats.org/markup-compatibility/2006" xmlns:aink="http://schemas.microsoft.com/office/drawing/2016/ink" xmlns:am3d="http://schemas.microsoft.com/office/drawing/2017/model3d" xmlns:o="urn:schemas-microsoft-com:office:office" xmlns:oel="http://schemas.microsoft.com/office/2019/extlst" xmlns:r="http://schemas.openxmlformats.org/officeDocument/2006/relationships" xmlns:m="http://schemas.openxmlformats.org/officeDocument/2006/math" xmlns:v="urn:schemas-microsoft-com:vml" xmlns:wp14="http://schemas.microsoft.com/office/word/2010/wordprocessingDrawing" xmlns:wp="http://schemas.openxmlformats.org/drawingml/2006/wordprocessingDrawing" xmlns:w10="urn:schemas-microsoft-com:office:word" xmlns:w="http://schemas.openxmlformats.org/wordprocessingml/2006/main" xmlns:w14="http://schemas.microsoft.com/office/word/2010/wordml" xmlns:w15="http://schemas.microsoft.com/office/word/2012/wordml" xmlns:w16cei="http://schemas.microsoft.com/office/word/2026/wordml/cei" xmlns:w16cex="http://schemas.microsoft.com/office/word/2018/wordml/cex" xmlns:w16cid="http://schemas.microsoft.com/office/word/2016/wordml/cid" xmlns:w16="http://schemas.microsoft.com/office/word/2018/wordml" xmlns:w16du="http://schemas.microsoft.com/office/word/2023/wordml/word16du" xmlns:w16sdtdh="http://schemas.microsoft.com/office/word/2020/wordml/sdtdatahash" xmlns:w16sdtfl="http://schemas.microsoft.com/office/word/2024/wordml/sdtformatlock" xmlns:w16se="http://schemas.microsoft.com/office/word/2015/wordml/symex" xmlns:wpg="http://schemas.microsoft.com/office/word/2010/wordprocessingGroup" xmlns:wpi="http://schemas.microsoft.com/office/word/2010/wordprocessingInk" xmlns:wne="http://schemas.microsoft.com/office/word/2006/wordml" xmlns:wps="http://schemas.microsoft.com/office/word/2010/wordprocessingShape" mc:Ignorable="w14 w15 w16se w16cid w16 w16cex w16sdtdh w16sdtfl w16du wp14">
   <w:p>
     <w:pPr>
       <w:pStyle w:val="Header"/>
@@ -6152,7 +5311,7 @@
 </file>
 
 <file path=word/numbering.xml><?xml version="1.0" encoding="utf-8"?>
-<w:numbering xmlns:wpc="http://schemas.microsoft.com/office/word/2010/wordprocessingCanvas" xmlns:cx="http://schemas.microsoft.com/office/drawing/2014/chartex" xmlns:cx1="http://schemas.microsoft.com/office/drawing/2015/9/8/chartex" xmlns:cx2="http://schemas.microsoft.com/office/drawing/2015/10/21/chartex" xmlns:cx3="http://schemas.microsoft.com/office/drawing/2016/5/9/chartex" xmlns:cx4="http://schemas.microsoft.com/office/drawing/2016/5/10/chartex" xmlns:cx5="http://schemas.microsoft.com/office/drawing/2016/5/11/chartex" xmlns:cx6="http://schemas.microsoft.com/office/drawing/2016/5/12/chartex" xmlns:cx7="http://schemas.microsoft.com/office/drawing/2016/5/13/chartex" xmlns:cx8="http://schemas.microsoft.com/office/drawing/2016/5/14/chartex" xmlns:mc="http://schemas.openxmlformats.org/markup-compatibility/2006" xmlns:aink="http://schemas.microsoft.com/office/drawing/2016/ink" xmlns:am3d="http://schemas.microsoft.com/office/drawing/2017/model3d" xmlns:o="urn:schemas-microsoft-com:office:office" xmlns:r="http://schemas.openxmlformats.org/officeDocument/2006/relationships" xmlns:m="http://schemas.openxmlformats.org/officeDocument/2006/math" xmlns:v="urn:schemas-microsoft-com:vml" xmlns:wp14="http://schemas.microsoft.com/office/word/2010/wordprocessingDrawing" xmlns:wp="http://schemas.openxmlformats.org/drawingml/2006/wordprocessingDrawing" xmlns:w10="urn:schemas-microsoft-com:office:word" xmlns:w="http://schemas.openxmlformats.org/wordprocessingml/2006/main" xmlns:w14="http://schemas.microsoft.com/office/word/2010/wordml" xmlns:w15="http://schemas.microsoft.com/office/word/2012/wordml" xmlns:w16cex="http://schemas.microsoft.com/office/word/2018/wordml/cex" xmlns:w16cid="http://schemas.microsoft.com/office/word/2016/wordml/cid" xmlns:w16="http://schemas.microsoft.com/office/word/2018/wordml" xmlns:w16sdtdh="http://schemas.microsoft.com/office/word/2020/wordml/sdtdatahash" xmlns:w16se="http://schemas.microsoft.com/office/word/2015/wordml/symex" xmlns:wpg="http://schemas.microsoft.com/office/word/2010/wordprocessingGroup" xmlns:wpi="http://schemas.microsoft.com/office/word/2010/wordprocessingInk" xmlns:wne="http://schemas.microsoft.com/office/word/2006/wordml" xmlns:wps="http://schemas.microsoft.com/office/word/2010/wordprocessingShape" mc:Ignorable="w14 w15 w16se w16cid w16 w16cex w16sdtdh wp14">
+<w:numbering xmlns:wpc="http://schemas.microsoft.com/office/word/2010/wordprocessingCanvas" xmlns:cx="http://schemas.microsoft.com/office/drawing/2014/chartex" xmlns:cx1="http://schemas.microsoft.com/office/drawing/2015/9/8/chartex" xmlns:cx2="http://schemas.microsoft.com/office/drawing/2015/10/21/chartex" xmlns:cx3="http://schemas.microsoft.com/office/drawing/2016/5/9/chartex" xmlns:cx4="http://schemas.microsoft.com/office/drawing/2016/5/10/chartex" xmlns:cx5="http://schemas.microsoft.com/office/drawing/2016/5/11/chartex" xmlns:cx6="http://schemas.microsoft.com/office/drawing/2016/5/12/chartex" xmlns:cx7="http://schemas.microsoft.com/office/drawing/2016/5/13/chartex" xmlns:cx8="http://schemas.microsoft.com/office/drawing/2016/5/14/chartex" xmlns:mc="http://schemas.openxmlformats.org/markup-compatibility/2006" xmlns:aink="http://schemas.microsoft.com/office/drawing/2016/ink" xmlns:am3d="http://schemas.microsoft.com/office/drawing/2017/model3d" xmlns:o="urn:schemas-microsoft-com:office:office" xmlns:oel="http://schemas.microsoft.com/office/2019/extlst" xmlns:r="http://schemas.openxmlformats.org/officeDocument/2006/relationships" xmlns:m="http://schemas.openxmlformats.org/officeDocument/2006/math" xmlns:v="urn:schemas-microsoft-com:vml" xmlns:wp14="http://schemas.microsoft.com/office/word/2010/wordprocessingDrawing" xmlns:wp="http://schemas.openxmlformats.org/drawingml/2006/wordprocessingDrawing" xmlns:w10="urn:schemas-microsoft-com:office:word" xmlns:w="http://schemas.openxmlformats.org/wordprocessingml/2006/main" xmlns:w14="http://schemas.microsoft.com/office/word/2010/wordml" xmlns:w15="http://schemas.microsoft.com/office/word/2012/wordml" xmlns:w16cei="http://schemas.microsoft.com/office/word/2026/wordml/cei" xmlns:w16cex="http://schemas.microsoft.com/office/word/2018/wordml/cex" xmlns:w16cid="http://schemas.microsoft.com/office/word/2016/wordml/cid" xmlns:w16="http://schemas.microsoft.com/office/word/2018/wordml" xmlns:w16du="http://schemas.microsoft.com/office/word/2023/wordml/word16du" xmlns:w16sdtdh="http://schemas.microsoft.com/office/word/2020/wordml/sdtdatahash" xmlns:w16sdtfl="http://schemas.microsoft.com/office/word/2024/wordml/sdtformatlock" xmlns:w16se="http://schemas.microsoft.com/office/word/2015/wordml/symex" xmlns:wpg="http://schemas.microsoft.com/office/word/2010/wordprocessingGroup" xmlns:wpi="http://schemas.microsoft.com/office/word/2010/wordprocessingInk" xmlns:wne="http://schemas.microsoft.com/office/word/2006/wordml" xmlns:wps="http://schemas.microsoft.com/office/word/2010/wordprocessingShape" mc:Ignorable="w14 w15 w16se w16cid w16 w16cex w16sdtdh w16sdtfl w16du wp14">
   <w:abstractNum w:abstractNumId="0" w15:restartNumberingAfterBreak="0">
     <w:nsid w:val="FFFFFF7C"/>
     <w:multiLevelType w:val="singleLevel"/>
@@ -6530,17 +5689,17 @@
       </w:pPr>
     </w:lvl>
   </w:abstractNum>
-  <w:num w:numId="1">
+  <w:num w:numId="1" w16cid:durableId="1961447478">
     <w:abstractNumId w:val="9"/>
   </w:num>
-  <w:num w:numId="2">
+  <w:num w:numId="2" w16cid:durableId="1533566910">
     <w:abstractNumId w:val="15"/>
   </w:num>
 </w:numbering>
 </file>
 
 <file path=word/styles.xml><?xml version="1.0" encoding="utf-8"?>
-<w:styles xmlns:mc="http://schemas.openxmlformats.org/markup-compatibility/2006" xmlns:r="http://schemas.openxmlformats.org/officeDocument/2006/relationships" xmlns:w="http://schemas.openxmlformats.org/wordprocessingml/2006/main" xmlns:w14="http://schemas.microsoft.com/office/word/2010/wordml" xmlns:w15="http://schemas.microsoft.com/office/word/2012/wordml" xmlns:w16cex="http://schemas.microsoft.com/office/word/2018/wordml/cex" xmlns:w16cid="http://schemas.microsoft.com/office/word/2016/wordml/cid" xmlns:w16="http://schemas.microsoft.com/office/word/2018/wordml" xmlns:w16sdtdh="http://schemas.microsoft.com/office/word/2020/wordml/sdtdatahash" xmlns:w16se="http://schemas.microsoft.com/office/word/2015/wordml/symex" mc:Ignorable="w14 w15 w16se w16cid w16 w16cex w16sdtdh">
+<w:styles xmlns:mc="http://schemas.openxmlformats.org/markup-compatibility/2006" xmlns:r="http://schemas.openxmlformats.org/officeDocument/2006/relationships" xmlns:w="http://schemas.openxmlformats.org/wordprocessingml/2006/main" xmlns:w14="http://schemas.microsoft.com/office/word/2010/wordml" xmlns:w15="http://schemas.microsoft.com/office/word/2012/wordml" xmlns:w16cex="http://schemas.microsoft.com/office/word/2018/wordml/cex" xmlns:w16cid="http://schemas.microsoft.com/office/word/2016/wordml/cid" xmlns:w16="http://schemas.microsoft.com/office/word/2018/wordml" xmlns:w16du="http://schemas.microsoft.com/office/word/2023/wordml/word16du" xmlns:w16sdtdh="http://schemas.microsoft.com/office/word/2020/wordml/sdtdatahash" xmlns:w16sdtfl="http://schemas.microsoft.com/office/word/2024/wordml/sdtformatlock" xmlns:w16se="http://schemas.microsoft.com/office/word/2015/wordml/symex" mc:Ignorable="w14 w15 w16se w16cid w16 w16cex w16sdtdh w16sdtfl w16du">
   <w:docDefaults>
     <w:rPrDefault>
       <w:rPr>
@@ -7148,6 +6307,7 @@
   <w:style w:type="character" w:default="1" w:styleId="DefaultParagraphFont">
     <w:name w:val="Default Paragraph Font"/>
     <w:uiPriority w:val="1"/>
+    <w:semiHidden/>
     <w:unhideWhenUsed/>
   </w:style>
   <w:style w:type="table" w:default="1" w:styleId="TableNormal">

</xml_diff>